<commit_message>
Clarify 'Всего' column in subdomain table: add secondary cases column
Co-Authored-By: Claude Sonnet 5.5 <noreply@anthropic.com>
Claude-Session: https://claude.ai/code/session_01Ag5KT8EuHDWdZtqqHeUG3y
</commit_message>
<xml_diff>
--- a/cases_by_tax_domain.docx
+++ b/cases_by_tax_domain.docx
@@ -23010,11 +23010,12 @@
         </w:tblBorders>
       </w:tblPr>
       <w:tblGrid>
-        <w:gridCol w:w="600"/>
-        <w:gridCol w:w="2900"/>
-        <w:gridCol w:w="2338"/>
+        <w:gridCol w:w="550"/>
         <w:gridCol w:w="2300"/>
+        <w:gridCol w:w="2100"/>
         <w:gridCol w:w="1500"/>
+        <w:gridCol w:w="1888"/>
+        <w:gridCol w:w="1300"/>
       </w:tblGrid>
       <w:tr>
         <w:trPr>
@@ -23022,7 +23023,7 @@
         </w:trPr>
         <w:tc>
           <w:tcPr>
-            <w:tcW w:type="dxa" w:w="600"/>
+            <w:tcW w:type="dxa" w:w="550"/>
             <w:tcBorders>
               <w:top w:val="single" w:color="BFBFBF" w:sz="4"/>
               <w:left w:val="single" w:color="BFBFBF" w:sz="4"/>
@@ -23044,72 +23045,10 @@
                 <w:b/>
                 <w:bCs/>
                 <w:color w:val="FFFFFF"/>
-                <w:sz w:val="18"/>
-                <w:szCs w:val="18"/>
+                <w:sz w:val="16"/>
+                <w:szCs w:val="16"/>
               </w:rPr>
               <w:t xml:space="preserve">№</w:t>
-            </w:r>
-          </w:p>
-        </w:tc>
-        <w:tc>
-          <w:tcPr>
-            <w:tcW w:type="dxa" w:w="2900"/>
-            <w:tcBorders>
-              <w:top w:val="single" w:color="BFBFBF" w:sz="4"/>
-              <w:left w:val="single" w:color="BFBFBF" w:sz="4"/>
-              <w:bottom w:val="single" w:color="BFBFBF" w:sz="4"/>
-              <w:right w:val="single" w:color="BFBFBF" w:sz="4"/>
-            </w:tcBorders>
-            <w:shd w:fill="1F3864" w:color="auto" w:val="clear"/>
-            <w:tcMar>
-              <w:top w:type="dxa" w:w="60"/>
-              <w:left w:type="dxa" w:w="100"/>
-              <w:bottom w:type="dxa" w:w="60"/>
-              <w:right w:type="dxa" w:w="100"/>
-            </w:tcMar>
-          </w:tcPr>
-          <w:p>
-            <w:r>
-              <w:rPr>
-                <w:rFonts w:ascii="Arial" w:cs="Arial" w:eastAsia="Arial" w:hAnsi="Arial"/>
-                <w:b/>
-                <w:bCs/>
-                <w:color w:val="FFFFFF"/>
-                <w:sz w:val="18"/>
-                <w:szCs w:val="18"/>
-              </w:rPr>
-              <w:t xml:space="preserve">Поддомен</w:t>
-            </w:r>
-          </w:p>
-        </w:tc>
-        <w:tc>
-          <w:tcPr>
-            <w:tcW w:type="dxa" w:w="2338"/>
-            <w:tcBorders>
-              <w:top w:val="single" w:color="BFBFBF" w:sz="4"/>
-              <w:left w:val="single" w:color="BFBFBF" w:sz="4"/>
-              <w:bottom w:val="single" w:color="BFBFBF" w:sz="4"/>
-              <w:right w:val="single" w:color="BFBFBF" w:sz="4"/>
-            </w:tcBorders>
-            <w:shd w:fill="1F3864" w:color="auto" w:val="clear"/>
-            <w:tcMar>
-              <w:top w:type="dxa" w:w="60"/>
-              <w:left w:type="dxa" w:w="100"/>
-              <w:bottom w:type="dxa" w:w="60"/>
-              <w:right w:type="dxa" w:w="100"/>
-            </w:tcMar>
-          </w:tcPr>
-          <w:p>
-            <w:r>
-              <w:rPr>
-                <w:rFonts w:ascii="Arial" w:cs="Arial" w:eastAsia="Arial" w:hAnsi="Arial"/>
-                <w:b/>
-                <w:bCs/>
-                <w:color w:val="FFFFFF"/>
-                <w:sz w:val="18"/>
-                <w:szCs w:val="18"/>
-              </w:rPr>
-              <w:t xml:space="preserve">Код (code)</w:t>
             </w:r>
           </w:p>
         </w:tc>
@@ -23137,10 +23076,41 @@
                 <w:b/>
                 <w:bCs/>
                 <w:color w:val="FFFFFF"/>
-                <w:sz w:val="18"/>
-                <w:szCs w:val="18"/>
+                <w:sz w:val="16"/>
+                <w:szCs w:val="16"/>
               </w:rPr>
-              <w:t xml:space="preserve">Основные (primary_case_ids)</w:t>
+              <w:t xml:space="preserve">Поддомен</w:t>
+            </w:r>
+          </w:p>
+        </w:tc>
+        <w:tc>
+          <w:tcPr>
+            <w:tcW w:type="dxa" w:w="2100"/>
+            <w:tcBorders>
+              <w:top w:val="single" w:color="BFBFBF" w:sz="4"/>
+              <w:left w:val="single" w:color="BFBFBF" w:sz="4"/>
+              <w:bottom w:val="single" w:color="BFBFBF" w:sz="4"/>
+              <w:right w:val="single" w:color="BFBFBF" w:sz="4"/>
+            </w:tcBorders>
+            <w:shd w:fill="1F3864" w:color="auto" w:val="clear"/>
+            <w:tcMar>
+              <w:top w:type="dxa" w:w="60"/>
+              <w:left w:type="dxa" w:w="100"/>
+              <w:bottom w:type="dxa" w:w="60"/>
+              <w:right w:type="dxa" w:w="100"/>
+            </w:tcMar>
+          </w:tcPr>
+          <w:p>
+            <w:r>
+              <w:rPr>
+                <w:rFonts w:ascii="Arial" w:cs="Arial" w:eastAsia="Arial" w:hAnsi="Arial"/>
+                <w:b/>
+                <w:bCs/>
+                <w:color w:val="FFFFFF"/>
+                <w:sz w:val="16"/>
+                <w:szCs w:val="16"/>
+              </w:rPr>
+              <w:t xml:space="preserve">Код (code)</w:t>
             </w:r>
           </w:p>
         </w:tc>
@@ -23168,10 +23138,72 @@
                 <w:b/>
                 <w:bCs/>
                 <w:color w:val="FFFFFF"/>
-                <w:sz w:val="18"/>
-                <w:szCs w:val="18"/>
+                <w:sz w:val="16"/>
+                <w:szCs w:val="16"/>
               </w:rPr>
-              <w:t xml:space="preserve">Всего</w:t>
+              <w:t xml:space="preserve">Основные (primary_case_ids)</w:t>
+            </w:r>
+          </w:p>
+        </w:tc>
+        <w:tc>
+          <w:tcPr>
+            <w:tcW w:type="dxa" w:w="1888"/>
+            <w:tcBorders>
+              <w:top w:val="single" w:color="BFBFBF" w:sz="4"/>
+              <w:left w:val="single" w:color="BFBFBF" w:sz="4"/>
+              <w:bottom w:val="single" w:color="BFBFBF" w:sz="4"/>
+              <w:right w:val="single" w:color="BFBFBF" w:sz="4"/>
+            </w:tcBorders>
+            <w:shd w:fill="1F3864" w:color="auto" w:val="clear"/>
+            <w:tcMar>
+              <w:top w:type="dxa" w:w="60"/>
+              <w:left w:type="dxa" w:w="100"/>
+              <w:bottom w:type="dxa" w:w="60"/>
+              <w:right w:type="dxa" w:w="100"/>
+            </w:tcMar>
+          </w:tcPr>
+          <w:p>
+            <w:r>
+              <w:rPr>
+                <w:rFonts w:ascii="Arial" w:cs="Arial" w:eastAsia="Arial" w:hAnsi="Arial"/>
+                <w:b/>
+                <w:bCs/>
+                <w:color w:val="FFFFFF"/>
+                <w:sz w:val="16"/>
+                <w:szCs w:val="16"/>
+              </w:rPr>
+              <w:t xml:space="preserve">Дополнительные (secondary_case_ids)</w:t>
+            </w:r>
+          </w:p>
+        </w:tc>
+        <w:tc>
+          <w:tcPr>
+            <w:tcW w:type="dxa" w:w="1300"/>
+            <w:tcBorders>
+              <w:top w:val="single" w:color="BFBFBF" w:sz="4"/>
+              <w:left w:val="single" w:color="BFBFBF" w:sz="4"/>
+              <w:bottom w:val="single" w:color="BFBFBF" w:sz="4"/>
+              <w:right w:val="single" w:color="BFBFBF" w:sz="4"/>
+            </w:tcBorders>
+            <w:shd w:fill="1F3864" w:color="auto" w:val="clear"/>
+            <w:tcMar>
+              <w:top w:type="dxa" w:w="60"/>
+              <w:left w:type="dxa" w:w="100"/>
+              <w:bottom w:type="dxa" w:w="60"/>
+              <w:right w:type="dxa" w:w="100"/>
+            </w:tcMar>
+          </w:tcPr>
+          <w:p>
+            <w:r>
+              <w:rPr>
+                <w:rFonts w:ascii="Arial" w:cs="Arial" w:eastAsia="Arial" w:hAnsi="Arial"/>
+                <w:b/>
+                <w:bCs/>
+                <w:color w:val="FFFFFF"/>
+                <w:sz w:val="16"/>
+                <w:szCs w:val="16"/>
+              </w:rPr>
+              <w:t xml:space="preserve">Всего (осн. + доп.)</w:t>
             </w:r>
           </w:p>
         </w:tc>
@@ -23179,7 +23211,7 @@
       <w:tr>
         <w:tc>
           <w:tcPr>
-            <w:tcW w:type="dxa" w:w="600"/>
+            <w:tcW w:type="dxa" w:w="550"/>
             <w:tcBorders>
               <w:top w:val="single" w:color="BFBFBF" w:sz="4"/>
               <w:left w:val="single" w:color="BFBFBF" w:sz="4"/>
@@ -23199,68 +23231,10 @@
                 <w:rFonts w:ascii="Arial" w:cs="Arial" w:eastAsia="Arial" w:hAnsi="Arial"/>
                 <w:b/>
                 <w:bCs/>
-                <w:sz w:val="18"/>
-                <w:szCs w:val="18"/>
-              </w:rPr>
-              <w:t xml:space="preserve">П1</w:t>
-            </w:r>
-          </w:p>
-        </w:tc>
-        <w:tc>
-          <w:tcPr>
-            <w:tcW w:type="dxa" w:w="2900"/>
-            <w:tcBorders>
-              <w:top w:val="single" w:color="BFBFBF" w:sz="4"/>
-              <w:left w:val="single" w:color="BFBFBF" w:sz="4"/>
-              <w:bottom w:val="single" w:color="BFBFBF" w:sz="4"/>
-              <w:right w:val="single" w:color="BFBFBF" w:sz="4"/>
-            </w:tcBorders>
-            <w:tcMar>
-              <w:top w:type="dxa" w:w="60"/>
-              <w:left w:type="dxa" w:w="100"/>
-              <w:bottom w:type="dxa" w:w="60"/>
-              <w:right w:type="dxa" w:w="100"/>
-            </w:tcMar>
-          </w:tcPr>
-          <w:p>
-            <w:r>
-              <w:rPr>
-                <w:rFonts w:ascii="Arial" w:cs="Arial" w:eastAsia="Arial" w:hAnsi="Arial"/>
-                <w:b w:val="false"/>
-                <w:bCs w:val="false"/>
-                <w:sz w:val="18"/>
-                <w:szCs w:val="18"/>
-              </w:rPr>
-              <w:t xml:space="preserve">Консолидация данных из разных источников</w:t>
-            </w:r>
-          </w:p>
-        </w:tc>
-        <w:tc>
-          <w:tcPr>
-            <w:tcW w:type="dxa" w:w="2338"/>
-            <w:tcBorders>
-              <w:top w:val="single" w:color="BFBFBF" w:sz="4"/>
-              <w:left w:val="single" w:color="BFBFBF" w:sz="4"/>
-              <w:bottom w:val="single" w:color="BFBFBF" w:sz="4"/>
-              <w:right w:val="single" w:color="BFBFBF" w:sz="4"/>
-            </w:tcBorders>
-            <w:tcMar>
-              <w:top w:type="dxa" w:w="60"/>
-              <w:left w:type="dxa" w:w="100"/>
-              <w:bottom w:type="dxa" w:w="60"/>
-              <w:right w:type="dxa" w:w="100"/>
-            </w:tcMar>
-          </w:tcPr>
-          <w:p>
-            <w:r>
-              <w:rPr>
-                <w:rFonts w:ascii="Arial" w:cs="Arial" w:eastAsia="Arial" w:hAnsi="Arial"/>
-                <w:b w:val="false"/>
-                <w:bCs w:val="false"/>
                 <w:sz w:val="16"/>
                 <w:szCs w:val="16"/>
               </w:rPr>
-              <w:t xml:space="preserve">DATA_CONSOLIDATION</w:t>
+              <w:t xml:space="preserve">П1</w:t>
             </w:r>
           </w:p>
         </w:tc>
@@ -23286,10 +23260,39 @@
                 <w:rFonts w:ascii="Arial" w:cs="Arial" w:eastAsia="Arial" w:hAnsi="Arial"/>
                 <w:b w:val="false"/>
                 <w:bCs w:val="false"/>
-                <w:sz w:val="18"/>
-                <w:szCs w:val="18"/>
+                <w:sz w:val="16"/>
+                <w:szCs w:val="16"/>
               </w:rPr>
-              <w:t xml:space="preserve">22, 42, 43</w:t>
+              <w:t xml:space="preserve">Консолидация данных из разных источников</w:t>
+            </w:r>
+          </w:p>
+        </w:tc>
+        <w:tc>
+          <w:tcPr>
+            <w:tcW w:type="dxa" w:w="2100"/>
+            <w:tcBorders>
+              <w:top w:val="single" w:color="BFBFBF" w:sz="4"/>
+              <w:left w:val="single" w:color="BFBFBF" w:sz="4"/>
+              <w:bottom w:val="single" w:color="BFBFBF" w:sz="4"/>
+              <w:right w:val="single" w:color="BFBFBF" w:sz="4"/>
+            </w:tcBorders>
+            <w:tcMar>
+              <w:top w:type="dxa" w:w="60"/>
+              <w:left w:type="dxa" w:w="100"/>
+              <w:bottom w:type="dxa" w:w="60"/>
+              <w:right w:type="dxa" w:w="100"/>
+            </w:tcMar>
+          </w:tcPr>
+          <w:p>
+            <w:r>
+              <w:rPr>
+                <w:rFonts w:ascii="Arial" w:cs="Arial" w:eastAsia="Arial" w:hAnsi="Arial"/>
+                <w:b w:val="false"/>
+                <w:bCs w:val="false"/>
+                <w:sz w:val="14"/>
+                <w:szCs w:val="14"/>
+              </w:rPr>
+              <w:t xml:space="preserve">DATA_CONSOLIDATION</w:t>
             </w:r>
           </w:p>
         </w:tc>
@@ -23315,76 +23318,16 @@
                 <w:rFonts w:ascii="Arial" w:cs="Arial" w:eastAsia="Arial" w:hAnsi="Arial"/>
                 <w:b w:val="false"/>
                 <w:bCs w:val="false"/>
-                <w:sz w:val="18"/>
-                <w:szCs w:val="18"/>
+                <w:sz w:val="16"/>
+                <w:szCs w:val="16"/>
               </w:rPr>
-              <w:t xml:space="preserve">12</w:t>
-            </w:r>
-          </w:p>
-        </w:tc>
-      </w:tr>
-      <w:tr>
-        <w:tc>
-          <w:tcPr>
-            <w:tcW w:type="dxa" w:w="600"/>
-            <w:tcBorders>
-              <w:top w:val="single" w:color="BFBFBF" w:sz="4"/>
-              <w:left w:val="single" w:color="BFBFBF" w:sz="4"/>
-              <w:bottom w:val="single" w:color="BFBFBF" w:sz="4"/>
-              <w:right w:val="single" w:color="BFBFBF" w:sz="4"/>
-            </w:tcBorders>
-            <w:tcMar>
-              <w:top w:type="dxa" w:w="60"/>
-              <w:left w:type="dxa" w:w="100"/>
-              <w:bottom w:type="dxa" w:w="60"/>
-              <w:right w:type="dxa" w:w="100"/>
-            </w:tcMar>
-          </w:tcPr>
-          <w:p>
-            <w:r>
-              <w:rPr>
-                <w:rFonts w:ascii="Arial" w:cs="Arial" w:eastAsia="Arial" w:hAnsi="Arial"/>
-                <w:b/>
-                <w:bCs/>
-                <w:sz w:val="18"/>
-                <w:szCs w:val="18"/>
-              </w:rPr>
-              <w:t xml:space="preserve">П2</w:t>
+              <w:t xml:space="preserve">22, 42, 43</w:t>
             </w:r>
           </w:p>
         </w:tc>
         <w:tc>
           <w:tcPr>
-            <w:tcW w:type="dxa" w:w="2900"/>
-            <w:tcBorders>
-              <w:top w:val="single" w:color="BFBFBF" w:sz="4"/>
-              <w:left w:val="single" w:color="BFBFBF" w:sz="4"/>
-              <w:bottom w:val="single" w:color="BFBFBF" w:sz="4"/>
-              <w:right w:val="single" w:color="BFBFBF" w:sz="4"/>
-            </w:tcBorders>
-            <w:tcMar>
-              <w:top w:type="dxa" w:w="60"/>
-              <w:left w:type="dxa" w:w="100"/>
-              <w:bottom w:type="dxa" w:w="60"/>
-              <w:right w:type="dxa" w:w="100"/>
-            </w:tcMar>
-          </w:tcPr>
-          <w:p>
-            <w:r>
-              <w:rPr>
-                <w:rFonts w:ascii="Arial" w:cs="Arial" w:eastAsia="Arial" w:hAnsi="Arial"/>
-                <w:b w:val="false"/>
-                <w:bCs w:val="false"/>
-                <w:sz w:val="18"/>
-                <w:szCs w:val="18"/>
-              </w:rPr>
-              <w:t xml:space="preserve">Анализ и извлечение из больших документов</w:t>
-            </w:r>
-          </w:p>
-        </w:tc>
-        <w:tc>
-          <w:tcPr>
-            <w:tcW w:type="dxa" w:w="2338"/>
+            <w:tcW w:type="dxa" w:w="1888"/>
             <w:tcBorders>
               <w:top w:val="single" w:color="BFBFBF" w:sz="4"/>
               <w:left w:val="single" w:color="BFBFBF" w:sz="4"/>
@@ -23407,7 +23350,67 @@
                 <w:sz w:val="16"/>
                 <w:szCs w:val="16"/>
               </w:rPr>
-              <w:t xml:space="preserve">DOC_ANALYSIS</w:t>
+              <w:t xml:space="preserve">10, 12, 16, 24, 26, 34, 38, 40, 46</w:t>
+            </w:r>
+          </w:p>
+        </w:tc>
+        <w:tc>
+          <w:tcPr>
+            <w:tcW w:type="dxa" w:w="1300"/>
+            <w:tcBorders>
+              <w:top w:val="single" w:color="BFBFBF" w:sz="4"/>
+              <w:left w:val="single" w:color="BFBFBF" w:sz="4"/>
+              <w:bottom w:val="single" w:color="BFBFBF" w:sz="4"/>
+              <w:right w:val="single" w:color="BFBFBF" w:sz="4"/>
+            </w:tcBorders>
+            <w:tcMar>
+              <w:top w:type="dxa" w:w="60"/>
+              <w:left w:type="dxa" w:w="100"/>
+              <w:bottom w:type="dxa" w:w="60"/>
+              <w:right w:type="dxa" w:w="100"/>
+            </w:tcMar>
+          </w:tcPr>
+          <w:p>
+            <w:r>
+              <w:rPr>
+                <w:rFonts w:ascii="Arial" w:cs="Arial" w:eastAsia="Arial" w:hAnsi="Arial"/>
+                <w:b/>
+                <w:bCs/>
+                <w:sz w:val="16"/>
+                <w:szCs w:val="16"/>
+              </w:rPr>
+              <w:t xml:space="preserve">3 + 9 = 12</w:t>
+            </w:r>
+          </w:p>
+        </w:tc>
+      </w:tr>
+      <w:tr>
+        <w:tc>
+          <w:tcPr>
+            <w:tcW w:type="dxa" w:w="550"/>
+            <w:tcBorders>
+              <w:top w:val="single" w:color="BFBFBF" w:sz="4"/>
+              <w:left w:val="single" w:color="BFBFBF" w:sz="4"/>
+              <w:bottom w:val="single" w:color="BFBFBF" w:sz="4"/>
+              <w:right w:val="single" w:color="BFBFBF" w:sz="4"/>
+            </w:tcBorders>
+            <w:tcMar>
+              <w:top w:type="dxa" w:w="60"/>
+              <w:left w:type="dxa" w:w="100"/>
+              <w:bottom w:type="dxa" w:w="60"/>
+              <w:right w:type="dxa" w:w="100"/>
+            </w:tcMar>
+          </w:tcPr>
+          <w:p>
+            <w:r>
+              <w:rPr>
+                <w:rFonts w:ascii="Arial" w:cs="Arial" w:eastAsia="Arial" w:hAnsi="Arial"/>
+                <w:b/>
+                <w:bCs/>
+                <w:sz w:val="16"/>
+                <w:szCs w:val="16"/>
+              </w:rPr>
+              <w:t xml:space="preserve">П2</w:t>
             </w:r>
           </w:p>
         </w:tc>
@@ -23433,10 +23436,39 @@
                 <w:rFonts w:ascii="Arial" w:cs="Arial" w:eastAsia="Arial" w:hAnsi="Arial"/>
                 <w:b w:val="false"/>
                 <w:bCs w:val="false"/>
-                <w:sz w:val="18"/>
-                <w:szCs w:val="18"/>
+                <w:sz w:val="16"/>
+                <w:szCs w:val="16"/>
               </w:rPr>
-              <w:t xml:space="preserve">7, 37, 39, 47</w:t>
+              <w:t xml:space="preserve">Анализ и извлечение из больших документов</w:t>
+            </w:r>
+          </w:p>
+        </w:tc>
+        <w:tc>
+          <w:tcPr>
+            <w:tcW w:type="dxa" w:w="2100"/>
+            <w:tcBorders>
+              <w:top w:val="single" w:color="BFBFBF" w:sz="4"/>
+              <w:left w:val="single" w:color="BFBFBF" w:sz="4"/>
+              <w:bottom w:val="single" w:color="BFBFBF" w:sz="4"/>
+              <w:right w:val="single" w:color="BFBFBF" w:sz="4"/>
+            </w:tcBorders>
+            <w:tcMar>
+              <w:top w:type="dxa" w:w="60"/>
+              <w:left w:type="dxa" w:w="100"/>
+              <w:bottom w:type="dxa" w:w="60"/>
+              <w:right w:type="dxa" w:w="100"/>
+            </w:tcMar>
+          </w:tcPr>
+          <w:p>
+            <w:r>
+              <w:rPr>
+                <w:rFonts w:ascii="Arial" w:cs="Arial" w:eastAsia="Arial" w:hAnsi="Arial"/>
+                <w:b w:val="false"/>
+                <w:bCs w:val="false"/>
+                <w:sz w:val="14"/>
+                <w:szCs w:val="14"/>
+              </w:rPr>
+              <w:t xml:space="preserve">DOC_ANALYSIS</w:t>
             </w:r>
           </w:p>
         </w:tc>
@@ -23462,76 +23494,16 @@
                 <w:rFonts w:ascii="Arial" w:cs="Arial" w:eastAsia="Arial" w:hAnsi="Arial"/>
                 <w:b w:val="false"/>
                 <w:bCs w:val="false"/>
-                <w:sz w:val="18"/>
-                <w:szCs w:val="18"/>
+                <w:sz w:val="16"/>
+                <w:szCs w:val="16"/>
               </w:rPr>
-              <w:t xml:space="preserve">11</w:t>
-            </w:r>
-          </w:p>
-        </w:tc>
-      </w:tr>
-      <w:tr>
-        <w:tc>
-          <w:tcPr>
-            <w:tcW w:type="dxa" w:w="600"/>
-            <w:tcBorders>
-              <w:top w:val="single" w:color="BFBFBF" w:sz="4"/>
-              <w:left w:val="single" w:color="BFBFBF" w:sz="4"/>
-              <w:bottom w:val="single" w:color="BFBFBF" w:sz="4"/>
-              <w:right w:val="single" w:color="BFBFBF" w:sz="4"/>
-            </w:tcBorders>
-            <w:tcMar>
-              <w:top w:type="dxa" w:w="60"/>
-              <w:left w:type="dxa" w:w="100"/>
-              <w:bottom w:type="dxa" w:w="60"/>
-              <w:right w:type="dxa" w:w="100"/>
-            </w:tcMar>
-          </w:tcPr>
-          <w:p>
-            <w:r>
-              <w:rPr>
-                <w:rFonts w:ascii="Arial" w:cs="Arial" w:eastAsia="Arial" w:hAnsi="Arial"/>
-                <w:b/>
-                <w:bCs/>
-                <w:sz w:val="18"/>
-                <w:szCs w:val="18"/>
-              </w:rPr>
-              <w:t xml:space="preserve">П3</w:t>
+              <w:t xml:space="preserve">7, 37, 39, 47</w:t>
             </w:r>
           </w:p>
         </w:tc>
         <w:tc>
           <w:tcPr>
-            <w:tcW w:type="dxa" w:w="2900"/>
-            <w:tcBorders>
-              <w:top w:val="single" w:color="BFBFBF" w:sz="4"/>
-              <w:left w:val="single" w:color="BFBFBF" w:sz="4"/>
-              <w:bottom w:val="single" w:color="BFBFBF" w:sz="4"/>
-              <w:right w:val="single" w:color="BFBFBF" w:sz="4"/>
-            </w:tcBorders>
-            <w:tcMar>
-              <w:top w:type="dxa" w:w="60"/>
-              <w:left w:type="dxa" w:w="100"/>
-              <w:bottom w:type="dxa" w:w="60"/>
-              <w:right w:type="dxa" w:w="100"/>
-            </w:tcMar>
-          </w:tcPr>
-          <w:p>
-            <w:r>
-              <w:rPr>
-                <w:rFonts w:ascii="Arial" w:cs="Arial" w:eastAsia="Arial" w:hAnsi="Arial"/>
-                <w:b w:val="false"/>
-                <w:bCs w:val="false"/>
-                <w:sz w:val="18"/>
-                <w:szCs w:val="18"/>
-              </w:rPr>
-              <w:t xml:space="preserve">Проверка на соответствие нормам, срокам и эталонам</w:t>
-            </w:r>
-          </w:p>
-        </w:tc>
-        <w:tc>
-          <w:tcPr>
-            <w:tcW w:type="dxa" w:w="2338"/>
+            <w:tcW w:type="dxa" w:w="1888"/>
             <w:tcBorders>
               <w:top w:val="single" w:color="BFBFBF" w:sz="4"/>
               <w:left w:val="single" w:color="BFBFBF" w:sz="4"/>
@@ -23554,7 +23526,67 @@
                 <w:sz w:val="16"/>
                 <w:szCs w:val="16"/>
               </w:rPr>
-              <w:t xml:space="preserve">COMPLIANCE_CHECK</w:t>
+              <w:t xml:space="preserve">6, 11, 21, 31, 33, 44, 45</w:t>
+            </w:r>
+          </w:p>
+        </w:tc>
+        <w:tc>
+          <w:tcPr>
+            <w:tcW w:type="dxa" w:w="1300"/>
+            <w:tcBorders>
+              <w:top w:val="single" w:color="BFBFBF" w:sz="4"/>
+              <w:left w:val="single" w:color="BFBFBF" w:sz="4"/>
+              <w:bottom w:val="single" w:color="BFBFBF" w:sz="4"/>
+              <w:right w:val="single" w:color="BFBFBF" w:sz="4"/>
+            </w:tcBorders>
+            <w:tcMar>
+              <w:top w:type="dxa" w:w="60"/>
+              <w:left w:type="dxa" w:w="100"/>
+              <w:bottom w:type="dxa" w:w="60"/>
+              <w:right w:type="dxa" w:w="100"/>
+            </w:tcMar>
+          </w:tcPr>
+          <w:p>
+            <w:r>
+              <w:rPr>
+                <w:rFonts w:ascii="Arial" w:cs="Arial" w:eastAsia="Arial" w:hAnsi="Arial"/>
+                <w:b/>
+                <w:bCs/>
+                <w:sz w:val="16"/>
+                <w:szCs w:val="16"/>
+              </w:rPr>
+              <w:t xml:space="preserve">4 + 7 = 11</w:t>
+            </w:r>
+          </w:p>
+        </w:tc>
+      </w:tr>
+      <w:tr>
+        <w:tc>
+          <w:tcPr>
+            <w:tcW w:type="dxa" w:w="550"/>
+            <w:tcBorders>
+              <w:top w:val="single" w:color="BFBFBF" w:sz="4"/>
+              <w:left w:val="single" w:color="BFBFBF" w:sz="4"/>
+              <w:bottom w:val="single" w:color="BFBFBF" w:sz="4"/>
+              <w:right w:val="single" w:color="BFBFBF" w:sz="4"/>
+            </w:tcBorders>
+            <w:tcMar>
+              <w:top w:type="dxa" w:w="60"/>
+              <w:left w:type="dxa" w:w="100"/>
+              <w:bottom w:type="dxa" w:w="60"/>
+              <w:right w:type="dxa" w:w="100"/>
+            </w:tcMar>
+          </w:tcPr>
+          <w:p>
+            <w:r>
+              <w:rPr>
+                <w:rFonts w:ascii="Arial" w:cs="Arial" w:eastAsia="Arial" w:hAnsi="Arial"/>
+                <w:b/>
+                <w:bCs/>
+                <w:sz w:val="16"/>
+                <w:szCs w:val="16"/>
+              </w:rPr>
+              <w:t xml:space="preserve">П3</w:t>
             </w:r>
           </w:p>
         </w:tc>
@@ -23580,10 +23612,39 @@
                 <w:rFonts w:ascii="Arial" w:cs="Arial" w:eastAsia="Arial" w:hAnsi="Arial"/>
                 <w:b w:val="false"/>
                 <w:bCs w:val="false"/>
-                <w:sz w:val="18"/>
-                <w:szCs w:val="18"/>
+                <w:sz w:val="16"/>
+                <w:szCs w:val="16"/>
               </w:rPr>
-              <w:t xml:space="preserve">6, 14, 35, 41</w:t>
+              <w:t xml:space="preserve">Проверка на соответствие нормам, срокам и эталонам</w:t>
+            </w:r>
+          </w:p>
+        </w:tc>
+        <w:tc>
+          <w:tcPr>
+            <w:tcW w:type="dxa" w:w="2100"/>
+            <w:tcBorders>
+              <w:top w:val="single" w:color="BFBFBF" w:sz="4"/>
+              <w:left w:val="single" w:color="BFBFBF" w:sz="4"/>
+              <w:bottom w:val="single" w:color="BFBFBF" w:sz="4"/>
+              <w:right w:val="single" w:color="BFBFBF" w:sz="4"/>
+            </w:tcBorders>
+            <w:tcMar>
+              <w:top w:type="dxa" w:w="60"/>
+              <w:left w:type="dxa" w:w="100"/>
+              <w:bottom w:type="dxa" w:w="60"/>
+              <w:right w:type="dxa" w:w="100"/>
+            </w:tcMar>
+          </w:tcPr>
+          <w:p>
+            <w:r>
+              <w:rPr>
+                <w:rFonts w:ascii="Arial" w:cs="Arial" w:eastAsia="Arial" w:hAnsi="Arial"/>
+                <w:b w:val="false"/>
+                <w:bCs w:val="false"/>
+                <w:sz w:val="14"/>
+                <w:szCs w:val="14"/>
+              </w:rPr>
+              <w:t xml:space="preserve">COMPLIANCE_CHECK</w:t>
             </w:r>
           </w:p>
         </w:tc>
@@ -23609,76 +23670,16 @@
                 <w:rFonts w:ascii="Arial" w:cs="Arial" w:eastAsia="Arial" w:hAnsi="Arial"/>
                 <w:b w:val="false"/>
                 <w:bCs w:val="false"/>
-                <w:sz w:val="18"/>
-                <w:szCs w:val="18"/>
+                <w:sz w:val="16"/>
+                <w:szCs w:val="16"/>
               </w:rPr>
-              <w:t xml:space="preserve">6</w:t>
-            </w:r>
-          </w:p>
-        </w:tc>
-      </w:tr>
-      <w:tr>
-        <w:tc>
-          <w:tcPr>
-            <w:tcW w:type="dxa" w:w="600"/>
-            <w:tcBorders>
-              <w:top w:val="single" w:color="BFBFBF" w:sz="4"/>
-              <w:left w:val="single" w:color="BFBFBF" w:sz="4"/>
-              <w:bottom w:val="single" w:color="BFBFBF" w:sz="4"/>
-              <w:right w:val="single" w:color="BFBFBF" w:sz="4"/>
-            </w:tcBorders>
-            <w:tcMar>
-              <w:top w:type="dxa" w:w="60"/>
-              <w:left w:type="dxa" w:w="100"/>
-              <w:bottom w:type="dxa" w:w="60"/>
-              <w:right w:type="dxa" w:w="100"/>
-            </w:tcMar>
-          </w:tcPr>
-          <w:p>
-            <w:r>
-              <w:rPr>
-                <w:rFonts w:ascii="Arial" w:cs="Arial" w:eastAsia="Arial" w:hAnsi="Arial"/>
-                <w:b/>
-                <w:bCs/>
-                <w:sz w:val="18"/>
-                <w:szCs w:val="18"/>
-              </w:rPr>
-              <w:t xml:space="preserve">П4</w:t>
+              <w:t xml:space="preserve">6, 14, 35, 41</w:t>
             </w:r>
           </w:p>
         </w:tc>
         <w:tc>
           <w:tcPr>
-            <w:tcW w:type="dxa" w:w="2900"/>
-            <w:tcBorders>
-              <w:top w:val="single" w:color="BFBFBF" w:sz="4"/>
-              <w:left w:val="single" w:color="BFBFBF" w:sz="4"/>
-              <w:bottom w:val="single" w:color="BFBFBF" w:sz="4"/>
-              <w:right w:val="single" w:color="BFBFBF" w:sz="4"/>
-            </w:tcBorders>
-            <w:tcMar>
-              <w:top w:type="dxa" w:w="60"/>
-              <w:left w:type="dxa" w:w="100"/>
-              <w:bottom w:type="dxa" w:w="60"/>
-              <w:right w:type="dxa" w:w="100"/>
-            </w:tcMar>
-          </w:tcPr>
-          <w:p>
-            <w:r>
-              <w:rPr>
-                <w:rFonts w:ascii="Arial" w:cs="Arial" w:eastAsia="Arial" w:hAnsi="Arial"/>
-                <w:b w:val="false"/>
-                <w:bCs w:val="false"/>
-                <w:sz w:val="18"/>
-                <w:szCs w:val="18"/>
-              </w:rPr>
-              <w:t xml:space="preserve">Сверка и сопоставление записей</w:t>
-            </w:r>
-          </w:p>
-        </w:tc>
-        <w:tc>
-          <w:tcPr>
-            <w:tcW w:type="dxa" w:w="2338"/>
+            <w:tcW w:type="dxa" w:w="1888"/>
             <w:tcBorders>
               <w:top w:val="single" w:color="BFBFBF" w:sz="4"/>
               <w:left w:val="single" w:color="BFBFBF" w:sz="4"/>
@@ -23701,7 +23702,67 @@
                 <w:sz w:val="16"/>
                 <w:szCs w:val="16"/>
               </w:rPr>
-              <w:t xml:space="preserve">RECONCILIATION</w:t>
+              <w:t xml:space="preserve">2, 5</w:t>
+            </w:r>
+          </w:p>
+        </w:tc>
+        <w:tc>
+          <w:tcPr>
+            <w:tcW w:type="dxa" w:w="1300"/>
+            <w:tcBorders>
+              <w:top w:val="single" w:color="BFBFBF" w:sz="4"/>
+              <w:left w:val="single" w:color="BFBFBF" w:sz="4"/>
+              <w:bottom w:val="single" w:color="BFBFBF" w:sz="4"/>
+              <w:right w:val="single" w:color="BFBFBF" w:sz="4"/>
+            </w:tcBorders>
+            <w:tcMar>
+              <w:top w:type="dxa" w:w="60"/>
+              <w:left w:type="dxa" w:w="100"/>
+              <w:bottom w:type="dxa" w:w="60"/>
+              <w:right w:type="dxa" w:w="100"/>
+            </w:tcMar>
+          </w:tcPr>
+          <w:p>
+            <w:r>
+              <w:rPr>
+                <w:rFonts w:ascii="Arial" w:cs="Arial" w:eastAsia="Arial" w:hAnsi="Arial"/>
+                <w:b/>
+                <w:bCs/>
+                <w:sz w:val="16"/>
+                <w:szCs w:val="16"/>
+              </w:rPr>
+              <w:t xml:space="preserve">4 + 2 = 6</w:t>
+            </w:r>
+          </w:p>
+        </w:tc>
+      </w:tr>
+      <w:tr>
+        <w:tc>
+          <w:tcPr>
+            <w:tcW w:type="dxa" w:w="550"/>
+            <w:tcBorders>
+              <w:top w:val="single" w:color="BFBFBF" w:sz="4"/>
+              <w:left w:val="single" w:color="BFBFBF" w:sz="4"/>
+              <w:bottom w:val="single" w:color="BFBFBF" w:sz="4"/>
+              <w:right w:val="single" w:color="BFBFBF" w:sz="4"/>
+            </w:tcBorders>
+            <w:tcMar>
+              <w:top w:type="dxa" w:w="60"/>
+              <w:left w:type="dxa" w:w="100"/>
+              <w:bottom w:type="dxa" w:w="60"/>
+              <w:right w:type="dxa" w:w="100"/>
+            </w:tcMar>
+          </w:tcPr>
+          <w:p>
+            <w:r>
+              <w:rPr>
+                <w:rFonts w:ascii="Arial" w:cs="Arial" w:eastAsia="Arial" w:hAnsi="Arial"/>
+                <w:b/>
+                <w:bCs/>
+                <w:sz w:val="16"/>
+                <w:szCs w:val="16"/>
+              </w:rPr>
+              <w:t xml:space="preserve">П4</w:t>
             </w:r>
           </w:p>
         </w:tc>
@@ -23727,10 +23788,39 @@
                 <w:rFonts w:ascii="Arial" w:cs="Arial" w:eastAsia="Arial" w:hAnsi="Arial"/>
                 <w:b w:val="false"/>
                 <w:bCs w:val="false"/>
-                <w:sz w:val="18"/>
-                <w:szCs w:val="18"/>
+                <w:sz w:val="16"/>
+                <w:szCs w:val="16"/>
               </w:rPr>
-              <w:t xml:space="preserve">1, 2, 16, 32</w:t>
+              <w:t xml:space="preserve">Сверка и сопоставление записей</w:t>
+            </w:r>
+          </w:p>
+        </w:tc>
+        <w:tc>
+          <w:tcPr>
+            <w:tcW w:type="dxa" w:w="2100"/>
+            <w:tcBorders>
+              <w:top w:val="single" w:color="BFBFBF" w:sz="4"/>
+              <w:left w:val="single" w:color="BFBFBF" w:sz="4"/>
+              <w:bottom w:val="single" w:color="BFBFBF" w:sz="4"/>
+              <w:right w:val="single" w:color="BFBFBF" w:sz="4"/>
+            </w:tcBorders>
+            <w:tcMar>
+              <w:top w:type="dxa" w:w="60"/>
+              <w:left w:type="dxa" w:w="100"/>
+              <w:bottom w:type="dxa" w:w="60"/>
+              <w:right w:type="dxa" w:w="100"/>
+            </w:tcMar>
+          </w:tcPr>
+          <w:p>
+            <w:r>
+              <w:rPr>
+                <w:rFonts w:ascii="Arial" w:cs="Arial" w:eastAsia="Arial" w:hAnsi="Arial"/>
+                <w:b w:val="false"/>
+                <w:bCs w:val="false"/>
+                <w:sz w:val="14"/>
+                <w:szCs w:val="14"/>
+              </w:rPr>
+              <w:t xml:space="preserve">RECONCILIATION</w:t>
             </w:r>
           </w:p>
         </w:tc>
@@ -23756,76 +23846,16 @@
                 <w:rFonts w:ascii="Arial" w:cs="Arial" w:eastAsia="Arial" w:hAnsi="Arial"/>
                 <w:b w:val="false"/>
                 <w:bCs w:val="false"/>
-                <w:sz w:val="18"/>
-                <w:szCs w:val="18"/>
+                <w:sz w:val="16"/>
+                <w:szCs w:val="16"/>
               </w:rPr>
-              <w:t xml:space="preserve">5</w:t>
-            </w:r>
-          </w:p>
-        </w:tc>
-      </w:tr>
-      <w:tr>
-        <w:tc>
-          <w:tcPr>
-            <w:tcW w:type="dxa" w:w="600"/>
-            <w:tcBorders>
-              <w:top w:val="single" w:color="BFBFBF" w:sz="4"/>
-              <w:left w:val="single" w:color="BFBFBF" w:sz="4"/>
-              <w:bottom w:val="single" w:color="BFBFBF" w:sz="4"/>
-              <w:right w:val="single" w:color="BFBFBF" w:sz="4"/>
-            </w:tcBorders>
-            <w:tcMar>
-              <w:top w:type="dxa" w:w="60"/>
-              <w:left w:type="dxa" w:w="100"/>
-              <w:bottom w:type="dxa" w:w="60"/>
-              <w:right w:type="dxa" w:w="100"/>
-            </w:tcMar>
-          </w:tcPr>
-          <w:p>
-            <w:r>
-              <w:rPr>
-                <w:rFonts w:ascii="Arial" w:cs="Arial" w:eastAsia="Arial" w:hAnsi="Arial"/>
-                <w:b/>
-                <w:bCs/>
-                <w:sz w:val="18"/>
-                <w:szCs w:val="18"/>
-              </w:rPr>
-              <w:t xml:space="preserve">П5</w:t>
+              <w:t xml:space="preserve">1, 2, 16, 32</w:t>
             </w:r>
           </w:p>
         </w:tc>
         <w:tc>
           <w:tcPr>
-            <w:tcW w:type="dxa" w:w="2900"/>
-            <w:tcBorders>
-              <w:top w:val="single" w:color="BFBFBF" w:sz="4"/>
-              <w:left w:val="single" w:color="BFBFBF" w:sz="4"/>
-              <w:bottom w:val="single" w:color="BFBFBF" w:sz="4"/>
-              <w:right w:val="single" w:color="BFBFBF" w:sz="4"/>
-            </w:tcBorders>
-            <w:tcMar>
-              <w:top w:type="dxa" w:w="60"/>
-              <w:left w:type="dxa" w:w="100"/>
-              <w:bottom w:type="dxa" w:w="60"/>
-              <w:right w:type="dxa" w:w="100"/>
-            </w:tcMar>
-          </w:tcPr>
-          <w:p>
-            <w:r>
-              <w:rPr>
-                <w:rFonts w:ascii="Arial" w:cs="Arial" w:eastAsia="Arial" w:hAnsi="Arial"/>
-                <w:b w:val="false"/>
-                <w:bCs w:val="false"/>
-                <w:sz w:val="18"/>
-                <w:szCs w:val="18"/>
-              </w:rPr>
-              <w:t xml:space="preserve">Классификация, дедубликация и кластеризация</w:t>
-            </w:r>
-          </w:p>
-        </w:tc>
-        <w:tc>
-          <w:tcPr>
-            <w:tcW w:type="dxa" w:w="2338"/>
+            <w:tcW w:type="dxa" w:w="1888"/>
             <w:tcBorders>
               <w:top w:val="single" w:color="BFBFBF" w:sz="4"/>
               <w:left w:val="single" w:color="BFBFBF" w:sz="4"/>
@@ -23848,7 +23878,67 @@
                 <w:sz w:val="16"/>
                 <w:szCs w:val="16"/>
               </w:rPr>
-              <w:t xml:space="preserve">CLASSIFICATION_DEDUP</w:t>
+              <w:t xml:space="preserve">14</w:t>
+            </w:r>
+          </w:p>
+        </w:tc>
+        <w:tc>
+          <w:tcPr>
+            <w:tcW w:type="dxa" w:w="1300"/>
+            <w:tcBorders>
+              <w:top w:val="single" w:color="BFBFBF" w:sz="4"/>
+              <w:left w:val="single" w:color="BFBFBF" w:sz="4"/>
+              <w:bottom w:val="single" w:color="BFBFBF" w:sz="4"/>
+              <w:right w:val="single" w:color="BFBFBF" w:sz="4"/>
+            </w:tcBorders>
+            <w:tcMar>
+              <w:top w:type="dxa" w:w="60"/>
+              <w:left w:type="dxa" w:w="100"/>
+              <w:bottom w:type="dxa" w:w="60"/>
+              <w:right w:type="dxa" w:w="100"/>
+            </w:tcMar>
+          </w:tcPr>
+          <w:p>
+            <w:r>
+              <w:rPr>
+                <w:rFonts w:ascii="Arial" w:cs="Arial" w:eastAsia="Arial" w:hAnsi="Arial"/>
+                <w:b/>
+                <w:bCs/>
+                <w:sz w:val="16"/>
+                <w:szCs w:val="16"/>
+              </w:rPr>
+              <w:t xml:space="preserve">4 + 1 = 5</w:t>
+            </w:r>
+          </w:p>
+        </w:tc>
+      </w:tr>
+      <w:tr>
+        <w:tc>
+          <w:tcPr>
+            <w:tcW w:type="dxa" w:w="550"/>
+            <w:tcBorders>
+              <w:top w:val="single" w:color="BFBFBF" w:sz="4"/>
+              <w:left w:val="single" w:color="BFBFBF" w:sz="4"/>
+              <w:bottom w:val="single" w:color="BFBFBF" w:sz="4"/>
+              <w:right w:val="single" w:color="BFBFBF" w:sz="4"/>
+            </w:tcBorders>
+            <w:tcMar>
+              <w:top w:type="dxa" w:w="60"/>
+              <w:left w:type="dxa" w:w="100"/>
+              <w:bottom w:type="dxa" w:w="60"/>
+              <w:right w:type="dxa" w:w="100"/>
+            </w:tcMar>
+          </w:tcPr>
+          <w:p>
+            <w:r>
+              <w:rPr>
+                <w:rFonts w:ascii="Arial" w:cs="Arial" w:eastAsia="Arial" w:hAnsi="Arial"/>
+                <w:b/>
+                <w:bCs/>
+                <w:sz w:val="16"/>
+                <w:szCs w:val="16"/>
+              </w:rPr>
+              <w:t xml:space="preserve">П5</w:t>
             </w:r>
           </w:p>
         </w:tc>
@@ -23874,10 +23964,39 @@
                 <w:rFonts w:ascii="Arial" w:cs="Arial" w:eastAsia="Arial" w:hAnsi="Arial"/>
                 <w:b w:val="false"/>
                 <w:bCs w:val="false"/>
-                <w:sz w:val="18"/>
-                <w:szCs w:val="18"/>
+                <w:sz w:val="16"/>
+                <w:szCs w:val="16"/>
               </w:rPr>
-              <w:t xml:space="preserve">13, 15, 21, 36</w:t>
+              <w:t xml:space="preserve">Классификация, дедубликация и кластеризация</w:t>
+            </w:r>
+          </w:p>
+        </w:tc>
+        <w:tc>
+          <w:tcPr>
+            <w:tcW w:type="dxa" w:w="2100"/>
+            <w:tcBorders>
+              <w:top w:val="single" w:color="BFBFBF" w:sz="4"/>
+              <w:left w:val="single" w:color="BFBFBF" w:sz="4"/>
+              <w:bottom w:val="single" w:color="BFBFBF" w:sz="4"/>
+              <w:right w:val="single" w:color="BFBFBF" w:sz="4"/>
+            </w:tcBorders>
+            <w:tcMar>
+              <w:top w:type="dxa" w:w="60"/>
+              <w:left w:type="dxa" w:w="100"/>
+              <w:bottom w:type="dxa" w:w="60"/>
+              <w:right w:type="dxa" w:w="100"/>
+            </w:tcMar>
+          </w:tcPr>
+          <w:p>
+            <w:r>
+              <w:rPr>
+                <w:rFonts w:ascii="Arial" w:cs="Arial" w:eastAsia="Arial" w:hAnsi="Arial"/>
+                <w:b w:val="false"/>
+                <w:bCs w:val="false"/>
+                <w:sz w:val="14"/>
+                <w:szCs w:val="14"/>
+              </w:rPr>
+              <w:t xml:space="preserve">CLASSIFICATION_DEDUP</w:t>
             </w:r>
           </w:p>
         </w:tc>
@@ -23903,76 +24022,16 @@
                 <w:rFonts w:ascii="Arial" w:cs="Arial" w:eastAsia="Arial" w:hAnsi="Arial"/>
                 <w:b w:val="false"/>
                 <w:bCs w:val="false"/>
-                <w:sz w:val="18"/>
-                <w:szCs w:val="18"/>
+                <w:sz w:val="16"/>
+                <w:szCs w:val="16"/>
               </w:rPr>
-              <w:t xml:space="preserve">8</w:t>
-            </w:r>
-          </w:p>
-        </w:tc>
-      </w:tr>
-      <w:tr>
-        <w:tc>
-          <w:tcPr>
-            <w:tcW w:type="dxa" w:w="600"/>
-            <w:tcBorders>
-              <w:top w:val="single" w:color="BFBFBF" w:sz="4"/>
-              <w:left w:val="single" w:color="BFBFBF" w:sz="4"/>
-              <w:bottom w:val="single" w:color="BFBFBF" w:sz="4"/>
-              <w:right w:val="single" w:color="BFBFBF" w:sz="4"/>
-            </w:tcBorders>
-            <w:tcMar>
-              <w:top w:type="dxa" w:w="60"/>
-              <w:left w:type="dxa" w:w="100"/>
-              <w:bottom w:type="dxa" w:w="60"/>
-              <w:right w:type="dxa" w:w="100"/>
-            </w:tcMar>
-          </w:tcPr>
-          <w:p>
-            <w:r>
-              <w:rPr>
-                <w:rFonts w:ascii="Arial" w:cs="Arial" w:eastAsia="Arial" w:hAnsi="Arial"/>
-                <w:b/>
-                <w:bCs/>
-                <w:sz w:val="18"/>
-                <w:szCs w:val="18"/>
-              </w:rPr>
-              <w:t xml:space="preserve">П6</w:t>
+              <w:t xml:space="preserve">13, 15, 21, 36</w:t>
             </w:r>
           </w:p>
         </w:tc>
         <w:tc>
           <w:tcPr>
-            <w:tcW w:type="dxa" w:w="2900"/>
-            <w:tcBorders>
-              <w:top w:val="single" w:color="BFBFBF" w:sz="4"/>
-              <w:left w:val="single" w:color="BFBFBF" w:sz="4"/>
-              <w:bottom w:val="single" w:color="BFBFBF" w:sz="4"/>
-              <w:right w:val="single" w:color="BFBFBF" w:sz="4"/>
-            </w:tcBorders>
-            <w:tcMar>
-              <w:top w:type="dxa" w:w="60"/>
-              <w:left w:type="dxa" w:w="100"/>
-              <w:bottom w:type="dxa" w:w="60"/>
-              <w:right w:type="dxa" w:w="100"/>
-            </w:tcMar>
-          </w:tcPr>
-          <w:p>
-            <w:r>
-              <w:rPr>
-                <w:rFonts w:ascii="Arial" w:cs="Arial" w:eastAsia="Arial" w:hAnsi="Arial"/>
-                <w:b w:val="false"/>
-                <w:bCs w:val="false"/>
-                <w:sz w:val="18"/>
-                <w:szCs w:val="18"/>
-              </w:rPr>
-              <w:t xml:space="preserve">Подготовка документов и справок</w:t>
-            </w:r>
-          </w:p>
-        </w:tc>
-        <w:tc>
-          <w:tcPr>
-            <w:tcW w:type="dxa" w:w="2338"/>
+            <w:tcW w:type="dxa" w:w="1888"/>
             <w:tcBorders>
               <w:top w:val="single" w:color="BFBFBF" w:sz="4"/>
               <w:left w:val="single" w:color="BFBFBF" w:sz="4"/>
@@ -23995,7 +24054,67 @@
                 <w:sz w:val="16"/>
                 <w:szCs w:val="16"/>
               </w:rPr>
-              <w:t xml:space="preserve">DOC_GENERATION</w:t>
+              <w:t xml:space="preserve">1, 25, 27, 37</w:t>
+            </w:r>
+          </w:p>
+        </w:tc>
+        <w:tc>
+          <w:tcPr>
+            <w:tcW w:type="dxa" w:w="1300"/>
+            <w:tcBorders>
+              <w:top w:val="single" w:color="BFBFBF" w:sz="4"/>
+              <w:left w:val="single" w:color="BFBFBF" w:sz="4"/>
+              <w:bottom w:val="single" w:color="BFBFBF" w:sz="4"/>
+              <w:right w:val="single" w:color="BFBFBF" w:sz="4"/>
+            </w:tcBorders>
+            <w:tcMar>
+              <w:top w:type="dxa" w:w="60"/>
+              <w:left w:type="dxa" w:w="100"/>
+              <w:bottom w:type="dxa" w:w="60"/>
+              <w:right w:type="dxa" w:w="100"/>
+            </w:tcMar>
+          </w:tcPr>
+          <w:p>
+            <w:r>
+              <w:rPr>
+                <w:rFonts w:ascii="Arial" w:cs="Arial" w:eastAsia="Arial" w:hAnsi="Arial"/>
+                <w:b/>
+                <w:bCs/>
+                <w:sz w:val="16"/>
+                <w:szCs w:val="16"/>
+              </w:rPr>
+              <w:t xml:space="preserve">4 + 4 = 8</w:t>
+            </w:r>
+          </w:p>
+        </w:tc>
+      </w:tr>
+      <w:tr>
+        <w:tc>
+          <w:tcPr>
+            <w:tcW w:type="dxa" w:w="550"/>
+            <w:tcBorders>
+              <w:top w:val="single" w:color="BFBFBF" w:sz="4"/>
+              <w:left w:val="single" w:color="BFBFBF" w:sz="4"/>
+              <w:bottom w:val="single" w:color="BFBFBF" w:sz="4"/>
+              <w:right w:val="single" w:color="BFBFBF" w:sz="4"/>
+            </w:tcBorders>
+            <w:tcMar>
+              <w:top w:type="dxa" w:w="60"/>
+              <w:left w:type="dxa" w:w="100"/>
+              <w:bottom w:type="dxa" w:w="60"/>
+              <w:right w:type="dxa" w:w="100"/>
+            </w:tcMar>
+          </w:tcPr>
+          <w:p>
+            <w:r>
+              <w:rPr>
+                <w:rFonts w:ascii="Arial" w:cs="Arial" w:eastAsia="Arial" w:hAnsi="Arial"/>
+                <w:b/>
+                <w:bCs/>
+                <w:sz w:val="16"/>
+                <w:szCs w:val="16"/>
+              </w:rPr>
+              <w:t xml:space="preserve">П6</w:t>
             </w:r>
           </w:p>
         </w:tc>
@@ -24021,10 +24140,39 @@
                 <w:rFonts w:ascii="Arial" w:cs="Arial" w:eastAsia="Arial" w:hAnsi="Arial"/>
                 <w:b w:val="false"/>
                 <w:bCs w:val="false"/>
-                <w:sz w:val="18"/>
-                <w:szCs w:val="18"/>
+                <w:sz w:val="16"/>
+                <w:szCs w:val="16"/>
               </w:rPr>
-              <w:t xml:space="preserve">5, 11, 33, 44</w:t>
+              <w:t xml:space="preserve">Подготовка документов и справок</w:t>
+            </w:r>
+          </w:p>
+        </w:tc>
+        <w:tc>
+          <w:tcPr>
+            <w:tcW w:type="dxa" w:w="2100"/>
+            <w:tcBorders>
+              <w:top w:val="single" w:color="BFBFBF" w:sz="4"/>
+              <w:left w:val="single" w:color="BFBFBF" w:sz="4"/>
+              <w:bottom w:val="single" w:color="BFBFBF" w:sz="4"/>
+              <w:right w:val="single" w:color="BFBFBF" w:sz="4"/>
+            </w:tcBorders>
+            <w:tcMar>
+              <w:top w:type="dxa" w:w="60"/>
+              <w:left w:type="dxa" w:w="100"/>
+              <w:bottom w:type="dxa" w:w="60"/>
+              <w:right w:type="dxa" w:w="100"/>
+            </w:tcMar>
+          </w:tcPr>
+          <w:p>
+            <w:r>
+              <w:rPr>
+                <w:rFonts w:ascii="Arial" w:cs="Arial" w:eastAsia="Arial" w:hAnsi="Arial"/>
+                <w:b w:val="false"/>
+                <w:bCs w:val="false"/>
+                <w:sz w:val="14"/>
+                <w:szCs w:val="14"/>
+              </w:rPr>
+              <w:t xml:space="preserve">DOC_GENERATION</w:t>
             </w:r>
           </w:p>
         </w:tc>
@@ -24050,76 +24198,16 @@
                 <w:rFonts w:ascii="Arial" w:cs="Arial" w:eastAsia="Arial" w:hAnsi="Arial"/>
                 <w:b w:val="false"/>
                 <w:bCs w:val="false"/>
-                <w:sz w:val="18"/>
-                <w:szCs w:val="18"/>
+                <w:sz w:val="16"/>
+                <w:szCs w:val="16"/>
               </w:rPr>
-              <w:t xml:space="preserve">11</w:t>
-            </w:r>
-          </w:p>
-        </w:tc>
-      </w:tr>
-      <w:tr>
-        <w:tc>
-          <w:tcPr>
-            <w:tcW w:type="dxa" w:w="600"/>
-            <w:tcBorders>
-              <w:top w:val="single" w:color="BFBFBF" w:sz="4"/>
-              <w:left w:val="single" w:color="BFBFBF" w:sz="4"/>
-              <w:bottom w:val="single" w:color="BFBFBF" w:sz="4"/>
-              <w:right w:val="single" w:color="BFBFBF" w:sz="4"/>
-            </w:tcBorders>
-            <w:tcMar>
-              <w:top w:type="dxa" w:w="60"/>
-              <w:left w:type="dxa" w:w="100"/>
-              <w:bottom w:type="dxa" w:w="60"/>
-              <w:right w:type="dxa" w:w="100"/>
-            </w:tcMar>
-          </w:tcPr>
-          <w:p>
-            <w:r>
-              <w:rPr>
-                <w:rFonts w:ascii="Arial" w:cs="Arial" w:eastAsia="Arial" w:hAnsi="Arial"/>
-                <w:b/>
-                <w:bCs/>
-                <w:sz w:val="18"/>
-                <w:szCs w:val="18"/>
-              </w:rPr>
-              <w:t xml:space="preserve">П7</w:t>
+              <w:t xml:space="preserve">5, 11, 33, 44</w:t>
             </w:r>
           </w:p>
         </w:tc>
         <w:tc>
           <w:tcPr>
-            <w:tcW w:type="dxa" w:w="2900"/>
-            <w:tcBorders>
-              <w:top w:val="single" w:color="BFBFBF" w:sz="4"/>
-              <w:left w:val="single" w:color="BFBFBF" w:sz="4"/>
-              <w:bottom w:val="single" w:color="BFBFBF" w:sz="4"/>
-              <w:right w:val="single" w:color="BFBFBF" w:sz="4"/>
-            </w:tcBorders>
-            <w:tcMar>
-              <w:top w:type="dxa" w:w="60"/>
-              <w:left w:type="dxa" w:w="100"/>
-              <w:bottom w:type="dxa" w:w="60"/>
-              <w:right w:type="dxa" w:w="100"/>
-            </w:tcMar>
-          </w:tcPr>
-          <w:p>
-            <w:r>
-              <w:rPr>
-                <w:rFonts w:ascii="Arial" w:cs="Arial" w:eastAsia="Arial" w:hAnsi="Arial"/>
-                <w:b w:val="false"/>
-                <w:bCs w:val="false"/>
-                <w:sz w:val="18"/>
-                <w:szCs w:val="18"/>
-              </w:rPr>
-              <w:t xml:space="preserve">Сбор данных из внешних источников</w:t>
-            </w:r>
-          </w:p>
-        </w:tc>
-        <w:tc>
-          <w:tcPr>
-            <w:tcW w:type="dxa" w:w="2338"/>
+            <w:tcW w:type="dxa" w:w="1888"/>
             <w:tcBorders>
               <w:top w:val="single" w:color="BFBFBF" w:sz="4"/>
               <w:left w:val="single" w:color="BFBFBF" w:sz="4"/>
@@ -24142,7 +24230,67 @@
                 <w:sz w:val="16"/>
                 <w:szCs w:val="16"/>
               </w:rPr>
-              <w:t xml:space="preserve">EXTERNAL_COLLECTION</w:t>
+              <w:t xml:space="preserve">13, 25, 36, 38, 39, 45, 47</w:t>
+            </w:r>
+          </w:p>
+        </w:tc>
+        <w:tc>
+          <w:tcPr>
+            <w:tcW w:type="dxa" w:w="1300"/>
+            <w:tcBorders>
+              <w:top w:val="single" w:color="BFBFBF" w:sz="4"/>
+              <w:left w:val="single" w:color="BFBFBF" w:sz="4"/>
+              <w:bottom w:val="single" w:color="BFBFBF" w:sz="4"/>
+              <w:right w:val="single" w:color="BFBFBF" w:sz="4"/>
+            </w:tcBorders>
+            <w:tcMar>
+              <w:top w:type="dxa" w:w="60"/>
+              <w:left w:type="dxa" w:w="100"/>
+              <w:bottom w:type="dxa" w:w="60"/>
+              <w:right w:type="dxa" w:w="100"/>
+            </w:tcMar>
+          </w:tcPr>
+          <w:p>
+            <w:r>
+              <w:rPr>
+                <w:rFonts w:ascii="Arial" w:cs="Arial" w:eastAsia="Arial" w:hAnsi="Arial"/>
+                <w:b/>
+                <w:bCs/>
+                <w:sz w:val="16"/>
+                <w:szCs w:val="16"/>
+              </w:rPr>
+              <w:t xml:space="preserve">4 + 7 = 11</w:t>
+            </w:r>
+          </w:p>
+        </w:tc>
+      </w:tr>
+      <w:tr>
+        <w:tc>
+          <w:tcPr>
+            <w:tcW w:type="dxa" w:w="550"/>
+            <w:tcBorders>
+              <w:top w:val="single" w:color="BFBFBF" w:sz="4"/>
+              <w:left w:val="single" w:color="BFBFBF" w:sz="4"/>
+              <w:bottom w:val="single" w:color="BFBFBF" w:sz="4"/>
+              <w:right w:val="single" w:color="BFBFBF" w:sz="4"/>
+            </w:tcBorders>
+            <w:tcMar>
+              <w:top w:type="dxa" w:w="60"/>
+              <w:left w:type="dxa" w:w="100"/>
+              <w:bottom w:type="dxa" w:w="60"/>
+              <w:right w:type="dxa" w:w="100"/>
+            </w:tcMar>
+          </w:tcPr>
+          <w:p>
+            <w:r>
+              <w:rPr>
+                <w:rFonts w:ascii="Arial" w:cs="Arial" w:eastAsia="Arial" w:hAnsi="Arial"/>
+                <w:b/>
+                <w:bCs/>
+                <w:sz w:val="16"/>
+                <w:szCs w:val="16"/>
+              </w:rPr>
+              <w:t xml:space="preserve">П7</w:t>
             </w:r>
           </w:p>
         </w:tc>
@@ -24168,10 +24316,39 @@
                 <w:rFonts w:ascii="Arial" w:cs="Arial" w:eastAsia="Arial" w:hAnsi="Arial"/>
                 <w:b w:val="false"/>
                 <w:bCs w:val="false"/>
-                <w:sz w:val="18"/>
-                <w:szCs w:val="18"/>
+                <w:sz w:val="16"/>
+                <w:szCs w:val="16"/>
               </w:rPr>
-              <w:t xml:space="preserve">8, 23, 24</w:t>
+              <w:t xml:space="preserve">Сбор данных из внешних источников</w:t>
+            </w:r>
+          </w:p>
+        </w:tc>
+        <w:tc>
+          <w:tcPr>
+            <w:tcW w:type="dxa" w:w="2100"/>
+            <w:tcBorders>
+              <w:top w:val="single" w:color="BFBFBF" w:sz="4"/>
+              <w:left w:val="single" w:color="BFBFBF" w:sz="4"/>
+              <w:bottom w:val="single" w:color="BFBFBF" w:sz="4"/>
+              <w:right w:val="single" w:color="BFBFBF" w:sz="4"/>
+            </w:tcBorders>
+            <w:tcMar>
+              <w:top w:type="dxa" w:w="60"/>
+              <w:left w:type="dxa" w:w="100"/>
+              <w:bottom w:type="dxa" w:w="60"/>
+              <w:right w:type="dxa" w:w="100"/>
+            </w:tcMar>
+          </w:tcPr>
+          <w:p>
+            <w:r>
+              <w:rPr>
+                <w:rFonts w:ascii="Arial" w:cs="Arial" w:eastAsia="Arial" w:hAnsi="Arial"/>
+                <w:b w:val="false"/>
+                <w:bCs w:val="false"/>
+                <w:sz w:val="14"/>
+                <w:szCs w:val="14"/>
+              </w:rPr>
+              <w:t xml:space="preserve">EXTERNAL_COLLECTION</w:t>
             </w:r>
           </w:p>
         </w:tc>
@@ -24197,76 +24374,16 @@
                 <w:rFonts w:ascii="Arial" w:cs="Arial" w:eastAsia="Arial" w:hAnsi="Arial"/>
                 <w:b w:val="false"/>
                 <w:bCs w:val="false"/>
-                <w:sz w:val="18"/>
-                <w:szCs w:val="18"/>
+                <w:sz w:val="16"/>
+                <w:szCs w:val="16"/>
               </w:rPr>
-              <w:t xml:space="preserve">8</w:t>
-            </w:r>
-          </w:p>
-        </w:tc>
-      </w:tr>
-      <w:tr>
-        <w:tc>
-          <w:tcPr>
-            <w:tcW w:type="dxa" w:w="600"/>
-            <w:tcBorders>
-              <w:top w:val="single" w:color="BFBFBF" w:sz="4"/>
-              <w:left w:val="single" w:color="BFBFBF" w:sz="4"/>
-              <w:bottom w:val="single" w:color="BFBFBF" w:sz="4"/>
-              <w:right w:val="single" w:color="BFBFBF" w:sz="4"/>
-            </w:tcBorders>
-            <w:tcMar>
-              <w:top w:type="dxa" w:w="60"/>
-              <w:left w:type="dxa" w:w="100"/>
-              <w:bottom w:type="dxa" w:w="60"/>
-              <w:right w:type="dxa" w:w="100"/>
-            </w:tcMar>
-          </w:tcPr>
-          <w:p>
-            <w:r>
-              <w:rPr>
-                <w:rFonts w:ascii="Arial" w:cs="Arial" w:eastAsia="Arial" w:hAnsi="Arial"/>
-                <w:b/>
-                <w:bCs/>
-                <w:sz w:val="18"/>
-                <w:szCs w:val="18"/>
-              </w:rPr>
-              <w:t xml:space="preserve">П8</w:t>
+              <w:t xml:space="preserve">8, 23, 24</w:t>
             </w:r>
           </w:p>
         </w:tc>
         <w:tc>
           <w:tcPr>
-            <w:tcW w:type="dxa" w:w="2900"/>
-            <w:tcBorders>
-              <w:top w:val="single" w:color="BFBFBF" w:sz="4"/>
-              <w:left w:val="single" w:color="BFBFBF" w:sz="4"/>
-              <w:bottom w:val="single" w:color="BFBFBF" w:sz="4"/>
-              <w:right w:val="single" w:color="BFBFBF" w:sz="4"/>
-            </w:tcBorders>
-            <w:tcMar>
-              <w:top w:type="dxa" w:w="60"/>
-              <w:left w:type="dxa" w:w="100"/>
-              <w:bottom w:type="dxa" w:w="60"/>
-              <w:right w:type="dxa" w:w="100"/>
-            </w:tcMar>
-          </w:tcPr>
-          <w:p>
-            <w:r>
-              <w:rPr>
-                <w:rFonts w:ascii="Arial" w:cs="Arial" w:eastAsia="Arial" w:hAnsi="Arial"/>
-                <w:b w:val="false"/>
-                <w:bCs w:val="false"/>
-                <w:sz w:val="18"/>
-                <w:szCs w:val="18"/>
-              </w:rPr>
-              <w:t xml:space="preserve">Аналитика, дашборды и регулярная отчётность</w:t>
-            </w:r>
-          </w:p>
-        </w:tc>
-        <w:tc>
-          <w:tcPr>
-            <w:tcW w:type="dxa" w:w="2338"/>
+            <w:tcW w:type="dxa" w:w="1888"/>
             <w:tcBorders>
               <w:top w:val="single" w:color="BFBFBF" w:sz="4"/>
               <w:left w:val="single" w:color="BFBFBF" w:sz="4"/>
@@ -24289,7 +24406,67 @@
                 <w:sz w:val="16"/>
                 <w:szCs w:val="16"/>
               </w:rPr>
-              <w:t xml:space="preserve">ANALYTICS_REPORTING</w:t>
+              <w:t xml:space="preserve">9, 10, 19, 22, 39</w:t>
+            </w:r>
+          </w:p>
+        </w:tc>
+        <w:tc>
+          <w:tcPr>
+            <w:tcW w:type="dxa" w:w="1300"/>
+            <w:tcBorders>
+              <w:top w:val="single" w:color="BFBFBF" w:sz="4"/>
+              <w:left w:val="single" w:color="BFBFBF" w:sz="4"/>
+              <w:bottom w:val="single" w:color="BFBFBF" w:sz="4"/>
+              <w:right w:val="single" w:color="BFBFBF" w:sz="4"/>
+            </w:tcBorders>
+            <w:tcMar>
+              <w:top w:type="dxa" w:w="60"/>
+              <w:left w:type="dxa" w:w="100"/>
+              <w:bottom w:type="dxa" w:w="60"/>
+              <w:right w:type="dxa" w:w="100"/>
+            </w:tcMar>
+          </w:tcPr>
+          <w:p>
+            <w:r>
+              <w:rPr>
+                <w:rFonts w:ascii="Arial" w:cs="Arial" w:eastAsia="Arial" w:hAnsi="Arial"/>
+                <w:b/>
+                <w:bCs/>
+                <w:sz w:val="16"/>
+                <w:szCs w:val="16"/>
+              </w:rPr>
+              <w:t xml:space="preserve">3 + 5 = 8</w:t>
+            </w:r>
+          </w:p>
+        </w:tc>
+      </w:tr>
+      <w:tr>
+        <w:tc>
+          <w:tcPr>
+            <w:tcW w:type="dxa" w:w="550"/>
+            <w:tcBorders>
+              <w:top w:val="single" w:color="BFBFBF" w:sz="4"/>
+              <w:left w:val="single" w:color="BFBFBF" w:sz="4"/>
+              <w:bottom w:val="single" w:color="BFBFBF" w:sz="4"/>
+              <w:right w:val="single" w:color="BFBFBF" w:sz="4"/>
+            </w:tcBorders>
+            <w:tcMar>
+              <w:top w:type="dxa" w:w="60"/>
+              <w:left w:type="dxa" w:w="100"/>
+              <w:bottom w:type="dxa" w:w="60"/>
+              <w:right w:type="dxa" w:w="100"/>
+            </w:tcMar>
+          </w:tcPr>
+          <w:p>
+            <w:r>
+              <w:rPr>
+                <w:rFonts w:ascii="Arial" w:cs="Arial" w:eastAsia="Arial" w:hAnsi="Arial"/>
+                <w:b/>
+                <w:bCs/>
+                <w:sz w:val="16"/>
+                <w:szCs w:val="16"/>
+              </w:rPr>
+              <w:t xml:space="preserve">П8</w:t>
             </w:r>
           </w:p>
         </w:tc>
@@ -24315,10 +24492,39 @@
                 <w:rFonts w:ascii="Arial" w:cs="Arial" w:eastAsia="Arial" w:hAnsi="Arial"/>
                 <w:b w:val="false"/>
                 <w:bCs w:val="false"/>
-                <w:sz w:val="18"/>
-                <w:szCs w:val="18"/>
+                <w:sz w:val="16"/>
+                <w:szCs w:val="16"/>
               </w:rPr>
-              <w:t xml:space="preserve">3, 12, 25, 26, 28, 29, 34, 40, 46</w:t>
+              <w:t xml:space="preserve">Аналитика, дашборды и регулярная отчётность</w:t>
+            </w:r>
+          </w:p>
+        </w:tc>
+        <w:tc>
+          <w:tcPr>
+            <w:tcW w:type="dxa" w:w="2100"/>
+            <w:tcBorders>
+              <w:top w:val="single" w:color="BFBFBF" w:sz="4"/>
+              <w:left w:val="single" w:color="BFBFBF" w:sz="4"/>
+              <w:bottom w:val="single" w:color="BFBFBF" w:sz="4"/>
+              <w:right w:val="single" w:color="BFBFBF" w:sz="4"/>
+            </w:tcBorders>
+            <w:tcMar>
+              <w:top w:type="dxa" w:w="60"/>
+              <w:left w:type="dxa" w:w="100"/>
+              <w:bottom w:type="dxa" w:w="60"/>
+              <w:right w:type="dxa" w:w="100"/>
+            </w:tcMar>
+          </w:tcPr>
+          <w:p>
+            <w:r>
+              <w:rPr>
+                <w:rFonts w:ascii="Arial" w:cs="Arial" w:eastAsia="Arial" w:hAnsi="Arial"/>
+                <w:b w:val="false"/>
+                <w:bCs w:val="false"/>
+                <w:sz w:val="14"/>
+                <w:szCs w:val="14"/>
+              </w:rPr>
+              <w:t xml:space="preserve">ANALYTICS_REPORTING</w:t>
             </w:r>
           </w:p>
         </w:tc>
@@ -24344,76 +24550,16 @@
                 <w:rFonts w:ascii="Arial" w:cs="Arial" w:eastAsia="Arial" w:hAnsi="Arial"/>
                 <w:b w:val="false"/>
                 <w:bCs w:val="false"/>
-                <w:sz w:val="18"/>
-                <w:szCs w:val="18"/>
+                <w:sz w:val="16"/>
+                <w:szCs w:val="16"/>
               </w:rPr>
-              <w:t xml:space="preserve">12</w:t>
-            </w:r>
-          </w:p>
-        </w:tc>
-      </w:tr>
-      <w:tr>
-        <w:tc>
-          <w:tcPr>
-            <w:tcW w:type="dxa" w:w="600"/>
-            <w:tcBorders>
-              <w:top w:val="single" w:color="BFBFBF" w:sz="4"/>
-              <w:left w:val="single" w:color="BFBFBF" w:sz="4"/>
-              <w:bottom w:val="single" w:color="BFBFBF" w:sz="4"/>
-              <w:right w:val="single" w:color="BFBFBF" w:sz="4"/>
-            </w:tcBorders>
-            <w:tcMar>
-              <w:top w:type="dxa" w:w="60"/>
-              <w:left w:type="dxa" w:w="100"/>
-              <w:bottom w:type="dxa" w:w="60"/>
-              <w:right w:type="dxa" w:w="100"/>
-            </w:tcMar>
-          </w:tcPr>
-          <w:p>
-            <w:r>
-              <w:rPr>
-                <w:rFonts w:ascii="Arial" w:cs="Arial" w:eastAsia="Arial" w:hAnsi="Arial"/>
-                <w:b/>
-                <w:bCs/>
-                <w:sz w:val="18"/>
-                <w:szCs w:val="18"/>
-              </w:rPr>
-              <w:t xml:space="preserve">П9</w:t>
+              <w:t xml:space="preserve">3, 12, 25, 26, 28, 29, 34, 40, 46</w:t>
             </w:r>
           </w:p>
         </w:tc>
         <w:tc>
           <w:tcPr>
-            <w:tcW w:type="dxa" w:w="2900"/>
-            <w:tcBorders>
-              <w:top w:val="single" w:color="BFBFBF" w:sz="4"/>
-              <w:left w:val="single" w:color="BFBFBF" w:sz="4"/>
-              <w:bottom w:val="single" w:color="BFBFBF" w:sz="4"/>
-              <w:right w:val="single" w:color="BFBFBF" w:sz="4"/>
-            </w:tcBorders>
-            <w:tcMar>
-              <w:top w:type="dxa" w:w="60"/>
-              <w:left w:type="dxa" w:w="100"/>
-              <w:bottom w:type="dxa" w:w="60"/>
-              <w:right w:type="dxa" w:w="100"/>
-            </w:tcMar>
-          </w:tcPr>
-          <w:p>
-            <w:r>
-              <w:rPr>
-                <w:rFonts w:ascii="Arial" w:cs="Arial" w:eastAsia="Arial" w:hAnsi="Arial"/>
-                <w:b w:val="false"/>
-                <w:bCs w:val="false"/>
-                <w:sz w:val="18"/>
-                <w:szCs w:val="18"/>
-              </w:rPr>
-              <w:t xml:space="preserve">Оценка платежеспособности, стоимости и рисков</w:t>
-            </w:r>
-          </w:p>
-        </w:tc>
-        <w:tc>
-          <w:tcPr>
-            <w:tcW w:type="dxa" w:w="2338"/>
+            <w:tcW w:type="dxa" w:w="1888"/>
             <w:tcBorders>
               <w:top w:val="single" w:color="BFBFBF" w:sz="4"/>
               <w:left w:val="single" w:color="BFBFBF" w:sz="4"/>
@@ -24436,7 +24582,67 @@
                 <w:sz w:val="16"/>
                 <w:szCs w:val="16"/>
               </w:rPr>
-              <w:t xml:space="preserve">RISK_VALUATION</w:t>
+              <w:t xml:space="preserve">15, 20, 30</w:t>
+            </w:r>
+          </w:p>
+        </w:tc>
+        <w:tc>
+          <w:tcPr>
+            <w:tcW w:type="dxa" w:w="1300"/>
+            <w:tcBorders>
+              <w:top w:val="single" w:color="BFBFBF" w:sz="4"/>
+              <w:left w:val="single" w:color="BFBFBF" w:sz="4"/>
+              <w:bottom w:val="single" w:color="BFBFBF" w:sz="4"/>
+              <w:right w:val="single" w:color="BFBFBF" w:sz="4"/>
+            </w:tcBorders>
+            <w:tcMar>
+              <w:top w:type="dxa" w:w="60"/>
+              <w:left w:type="dxa" w:w="100"/>
+              <w:bottom w:type="dxa" w:w="60"/>
+              <w:right w:type="dxa" w:w="100"/>
+            </w:tcMar>
+          </w:tcPr>
+          <w:p>
+            <w:r>
+              <w:rPr>
+                <w:rFonts w:ascii="Arial" w:cs="Arial" w:eastAsia="Arial" w:hAnsi="Arial"/>
+                <w:b/>
+                <w:bCs/>
+                <w:sz w:val="16"/>
+                <w:szCs w:val="16"/>
+              </w:rPr>
+              <w:t xml:space="preserve">9 + 3 = 12</w:t>
+            </w:r>
+          </w:p>
+        </w:tc>
+      </w:tr>
+      <w:tr>
+        <w:tc>
+          <w:tcPr>
+            <w:tcW w:type="dxa" w:w="550"/>
+            <w:tcBorders>
+              <w:top w:val="single" w:color="BFBFBF" w:sz="4"/>
+              <w:left w:val="single" w:color="BFBFBF" w:sz="4"/>
+              <w:bottom w:val="single" w:color="BFBFBF" w:sz="4"/>
+              <w:right w:val="single" w:color="BFBFBF" w:sz="4"/>
+            </w:tcBorders>
+            <w:tcMar>
+              <w:top w:type="dxa" w:w="60"/>
+              <w:left w:type="dxa" w:w="100"/>
+              <w:bottom w:type="dxa" w:w="60"/>
+              <w:right w:type="dxa" w:w="100"/>
+            </w:tcMar>
+          </w:tcPr>
+          <w:p>
+            <w:r>
+              <w:rPr>
+                <w:rFonts w:ascii="Arial" w:cs="Arial" w:eastAsia="Arial" w:hAnsi="Arial"/>
+                <w:b/>
+                <w:bCs/>
+                <w:sz w:val="16"/>
+                <w:szCs w:val="16"/>
+              </w:rPr>
+              <w:t xml:space="preserve">П9</w:t>
             </w:r>
           </w:p>
         </w:tc>
@@ -24462,10 +24668,39 @@
                 <w:rFonts w:ascii="Arial" w:cs="Arial" w:eastAsia="Arial" w:hAnsi="Arial"/>
                 <w:b w:val="false"/>
                 <w:bCs w:val="false"/>
-                <w:sz w:val="18"/>
-                <w:szCs w:val="18"/>
+                <w:sz w:val="16"/>
+                <w:szCs w:val="16"/>
               </w:rPr>
-              <w:t xml:space="preserve">9, 10, 27, 38, 45</w:t>
+              <w:t xml:space="preserve">Оценка платежеспособности, стоимости и рисков</w:t>
+            </w:r>
+          </w:p>
+        </w:tc>
+        <w:tc>
+          <w:tcPr>
+            <w:tcW w:type="dxa" w:w="2100"/>
+            <w:tcBorders>
+              <w:top w:val="single" w:color="BFBFBF" w:sz="4"/>
+              <w:left w:val="single" w:color="BFBFBF" w:sz="4"/>
+              <w:bottom w:val="single" w:color="BFBFBF" w:sz="4"/>
+              <w:right w:val="single" w:color="BFBFBF" w:sz="4"/>
+            </w:tcBorders>
+            <w:tcMar>
+              <w:top w:type="dxa" w:w="60"/>
+              <w:left w:type="dxa" w:w="100"/>
+              <w:bottom w:type="dxa" w:w="60"/>
+              <w:right w:type="dxa" w:w="100"/>
+            </w:tcMar>
+          </w:tcPr>
+          <w:p>
+            <w:r>
+              <w:rPr>
+                <w:rFonts w:ascii="Arial" w:cs="Arial" w:eastAsia="Arial" w:hAnsi="Arial"/>
+                <w:b w:val="false"/>
+                <w:bCs w:val="false"/>
+                <w:sz w:val="14"/>
+                <w:szCs w:val="14"/>
+              </w:rPr>
+              <w:t xml:space="preserve">RISK_VALUATION</w:t>
             </w:r>
           </w:p>
         </w:tc>
@@ -24491,76 +24726,16 @@
                 <w:rFonts w:ascii="Arial" w:cs="Arial" w:eastAsia="Arial" w:hAnsi="Arial"/>
                 <w:b w:val="false"/>
                 <w:bCs w:val="false"/>
-                <w:sz w:val="18"/>
-                <w:szCs w:val="18"/>
+                <w:sz w:val="16"/>
+                <w:szCs w:val="16"/>
               </w:rPr>
-              <w:t xml:space="preserve">5</w:t>
-            </w:r>
-          </w:p>
-        </w:tc>
-      </w:tr>
-      <w:tr>
-        <w:tc>
-          <w:tcPr>
-            <w:tcW w:type="dxa" w:w="600"/>
-            <w:tcBorders>
-              <w:top w:val="single" w:color="BFBFBF" w:sz="4"/>
-              <w:left w:val="single" w:color="BFBFBF" w:sz="4"/>
-              <w:bottom w:val="single" w:color="BFBFBF" w:sz="4"/>
-              <w:right w:val="single" w:color="BFBFBF" w:sz="4"/>
-            </w:tcBorders>
-            <w:tcMar>
-              <w:top w:type="dxa" w:w="60"/>
-              <w:left w:type="dxa" w:w="100"/>
-              <w:bottom w:type="dxa" w:w="60"/>
-              <w:right w:type="dxa" w:w="100"/>
-            </w:tcMar>
-          </w:tcPr>
-          <w:p>
-            <w:r>
-              <w:rPr>
-                <w:rFonts w:ascii="Arial" w:cs="Arial" w:eastAsia="Arial" w:hAnsi="Arial"/>
-                <w:b/>
-                <w:bCs/>
-                <w:sz w:val="18"/>
-                <w:szCs w:val="18"/>
-              </w:rPr>
-              <w:t xml:space="preserve">П10</w:t>
+              <w:t xml:space="preserve">9, 10, 27, 38, 45</w:t>
             </w:r>
           </w:p>
         </w:tc>
         <w:tc>
           <w:tcPr>
-            <w:tcW w:type="dxa" w:w="2900"/>
-            <w:tcBorders>
-              <w:top w:val="single" w:color="BFBFBF" w:sz="4"/>
-              <w:left w:val="single" w:color="BFBFBF" w:sz="4"/>
-              <w:bottom w:val="single" w:color="BFBFBF" w:sz="4"/>
-              <w:right w:val="single" w:color="BFBFBF" w:sz="4"/>
-            </w:tcBorders>
-            <w:tcMar>
-              <w:top w:type="dxa" w:w="60"/>
-              <w:left w:type="dxa" w:w="100"/>
-              <w:bottom w:type="dxa" w:w="60"/>
-              <w:right w:type="dxa" w:w="100"/>
-            </w:tcMar>
-          </w:tcPr>
-          <w:p>
-            <w:r>
-              <w:rPr>
-                <w:rFonts w:ascii="Arial" w:cs="Arial" w:eastAsia="Arial" w:hAnsi="Arial"/>
-                <w:b w:val="false"/>
-                <w:bCs w:val="false"/>
-                <w:sz w:val="18"/>
-                <w:szCs w:val="18"/>
-              </w:rPr>
-              <w:t xml:space="preserve">Качество данных, интеграция и доступ</w:t>
-            </w:r>
-          </w:p>
-        </w:tc>
-        <w:tc>
-          <w:tcPr>
-            <w:tcW w:type="dxa" w:w="2338"/>
+            <w:tcW w:type="dxa" w:w="1888"/>
             <w:tcBorders>
               <w:top w:val="single" w:color="BFBFBF" w:sz="4"/>
               <w:left w:val="single" w:color="BFBFBF" w:sz="4"/>
@@ -24583,7 +24758,67 @@
                 <w:sz w:val="16"/>
                 <w:szCs w:val="16"/>
               </w:rPr>
-              <w:t xml:space="preserve">DATA_QUALITY_ACCESS</w:t>
+              <w:t xml:space="preserve">—</w:t>
+            </w:r>
+          </w:p>
+        </w:tc>
+        <w:tc>
+          <w:tcPr>
+            <w:tcW w:type="dxa" w:w="1300"/>
+            <w:tcBorders>
+              <w:top w:val="single" w:color="BFBFBF" w:sz="4"/>
+              <w:left w:val="single" w:color="BFBFBF" w:sz="4"/>
+              <w:bottom w:val="single" w:color="BFBFBF" w:sz="4"/>
+              <w:right w:val="single" w:color="BFBFBF" w:sz="4"/>
+            </w:tcBorders>
+            <w:tcMar>
+              <w:top w:type="dxa" w:w="60"/>
+              <w:left w:type="dxa" w:w="100"/>
+              <w:bottom w:type="dxa" w:w="60"/>
+              <w:right w:type="dxa" w:w="100"/>
+            </w:tcMar>
+          </w:tcPr>
+          <w:p>
+            <w:r>
+              <w:rPr>
+                <w:rFonts w:ascii="Arial" w:cs="Arial" w:eastAsia="Arial" w:hAnsi="Arial"/>
+                <w:b/>
+                <w:bCs/>
+                <w:sz w:val="16"/>
+                <w:szCs w:val="16"/>
+              </w:rPr>
+              <w:t xml:space="preserve">5 + 0 = 5</w:t>
+            </w:r>
+          </w:p>
+        </w:tc>
+      </w:tr>
+      <w:tr>
+        <w:tc>
+          <w:tcPr>
+            <w:tcW w:type="dxa" w:w="550"/>
+            <w:tcBorders>
+              <w:top w:val="single" w:color="BFBFBF" w:sz="4"/>
+              <w:left w:val="single" w:color="BFBFBF" w:sz="4"/>
+              <w:bottom w:val="single" w:color="BFBFBF" w:sz="4"/>
+              <w:right w:val="single" w:color="BFBFBF" w:sz="4"/>
+            </w:tcBorders>
+            <w:tcMar>
+              <w:top w:type="dxa" w:w="60"/>
+              <w:left w:type="dxa" w:w="100"/>
+              <w:bottom w:type="dxa" w:w="60"/>
+              <w:right w:type="dxa" w:w="100"/>
+            </w:tcMar>
+          </w:tcPr>
+          <w:p>
+            <w:r>
+              <w:rPr>
+                <w:rFonts w:ascii="Arial" w:cs="Arial" w:eastAsia="Arial" w:hAnsi="Arial"/>
+                <w:b/>
+                <w:bCs/>
+                <w:sz w:val="16"/>
+                <w:szCs w:val="16"/>
+              </w:rPr>
+              <w:t xml:space="preserve">П10</w:t>
             </w:r>
           </w:p>
         </w:tc>
@@ -24609,10 +24844,39 @@
                 <w:rFonts w:ascii="Arial" w:cs="Arial" w:eastAsia="Arial" w:hAnsi="Arial"/>
                 <w:b w:val="false"/>
                 <w:bCs w:val="false"/>
-                <w:sz w:val="18"/>
-                <w:szCs w:val="18"/>
+                <w:sz w:val="16"/>
+                <w:szCs w:val="16"/>
               </w:rPr>
-              <w:t xml:space="preserve">18, 19, 20, 30</w:t>
+              <w:t xml:space="preserve">Качество данных, интеграция и доступ</w:t>
+            </w:r>
+          </w:p>
+        </w:tc>
+        <w:tc>
+          <w:tcPr>
+            <w:tcW w:type="dxa" w:w="2100"/>
+            <w:tcBorders>
+              <w:top w:val="single" w:color="BFBFBF" w:sz="4"/>
+              <w:left w:val="single" w:color="BFBFBF" w:sz="4"/>
+              <w:bottom w:val="single" w:color="BFBFBF" w:sz="4"/>
+              <w:right w:val="single" w:color="BFBFBF" w:sz="4"/>
+            </w:tcBorders>
+            <w:tcMar>
+              <w:top w:type="dxa" w:w="60"/>
+              <w:left w:type="dxa" w:w="100"/>
+              <w:bottom w:type="dxa" w:w="60"/>
+              <w:right w:type="dxa" w:w="100"/>
+            </w:tcMar>
+          </w:tcPr>
+          <w:p>
+            <w:r>
+              <w:rPr>
+                <w:rFonts w:ascii="Arial" w:cs="Arial" w:eastAsia="Arial" w:hAnsi="Arial"/>
+                <w:b w:val="false"/>
+                <w:bCs w:val="false"/>
+                <w:sz w:val="14"/>
+                <w:szCs w:val="14"/>
+              </w:rPr>
+              <w:t xml:space="preserve">DATA_QUALITY_ACCESS</w:t>
             </w:r>
           </w:p>
         </w:tc>
@@ -24638,76 +24902,16 @@
                 <w:rFonts w:ascii="Arial" w:cs="Arial" w:eastAsia="Arial" w:hAnsi="Arial"/>
                 <w:b w:val="false"/>
                 <w:bCs w:val="false"/>
-                <w:sz w:val="18"/>
-                <w:szCs w:val="18"/>
+                <w:sz w:val="16"/>
+                <w:szCs w:val="16"/>
               </w:rPr>
-              <w:t xml:space="preserve">4</w:t>
-            </w:r>
-          </w:p>
-        </w:tc>
-      </w:tr>
-      <w:tr>
-        <w:tc>
-          <w:tcPr>
-            <w:tcW w:type="dxa" w:w="600"/>
-            <w:tcBorders>
-              <w:top w:val="single" w:color="BFBFBF" w:sz="4"/>
-              <w:left w:val="single" w:color="BFBFBF" w:sz="4"/>
-              <w:bottom w:val="single" w:color="BFBFBF" w:sz="4"/>
-              <w:right w:val="single" w:color="BFBFBF" w:sz="4"/>
-            </w:tcBorders>
-            <w:tcMar>
-              <w:top w:type="dxa" w:w="60"/>
-              <w:left w:type="dxa" w:w="100"/>
-              <w:bottom w:type="dxa" w:w="60"/>
-              <w:right w:type="dxa" w:w="100"/>
-            </w:tcMar>
-          </w:tcPr>
-          <w:p>
-            <w:r>
-              <w:rPr>
-                <w:rFonts w:ascii="Arial" w:cs="Arial" w:eastAsia="Arial" w:hAnsi="Arial"/>
-                <w:b/>
-                <w:bCs/>
-                <w:sz w:val="18"/>
-                <w:szCs w:val="18"/>
-              </w:rPr>
-              <w:t xml:space="preserve">П11</w:t>
+              <w:t xml:space="preserve">18, 19, 20, 30</w:t>
             </w:r>
           </w:p>
         </w:tc>
         <w:tc>
           <w:tcPr>
-            <w:tcW w:type="dxa" w:w="2900"/>
-            <w:tcBorders>
-              <w:top w:val="single" w:color="BFBFBF" w:sz="4"/>
-              <w:left w:val="single" w:color="BFBFBF" w:sz="4"/>
-              <w:bottom w:val="single" w:color="BFBFBF" w:sz="4"/>
-              <w:right w:val="single" w:color="BFBFBF" w:sz="4"/>
-            </w:tcBorders>
-            <w:tcMar>
-              <w:top w:type="dxa" w:w="60"/>
-              <w:left w:type="dxa" w:w="100"/>
-              <w:bottom w:type="dxa" w:w="60"/>
-              <w:right w:type="dxa" w:w="100"/>
-            </w:tcMar>
-          </w:tcPr>
-          <w:p>
-            <w:r>
-              <w:rPr>
-                <w:rFonts w:ascii="Arial" w:cs="Arial" w:eastAsia="Arial" w:hAnsi="Arial"/>
-                <w:b w:val="false"/>
-                <w:bCs w:val="false"/>
-                <w:sz w:val="18"/>
-                <w:szCs w:val="18"/>
-              </w:rPr>
-              <w:t xml:space="preserve">Автоматизация процесса и агентные сценарии</w:t>
-            </w:r>
-          </w:p>
-        </w:tc>
-        <w:tc>
-          <w:tcPr>
-            <w:tcW w:type="dxa" w:w="2338"/>
+            <w:tcW w:type="dxa" w:w="1888"/>
             <w:tcBorders>
               <w:top w:val="single" w:color="BFBFBF" w:sz="4"/>
               <w:left w:val="single" w:color="BFBFBF" w:sz="4"/>
@@ -24730,7 +24934,67 @@
                 <w:sz w:val="16"/>
                 <w:szCs w:val="16"/>
               </w:rPr>
-              <w:t xml:space="preserve">PROCESS_AUTOMATION</w:t>
+              <w:t xml:space="preserve">—</w:t>
+            </w:r>
+          </w:p>
+        </w:tc>
+        <w:tc>
+          <w:tcPr>
+            <w:tcW w:type="dxa" w:w="1300"/>
+            <w:tcBorders>
+              <w:top w:val="single" w:color="BFBFBF" w:sz="4"/>
+              <w:left w:val="single" w:color="BFBFBF" w:sz="4"/>
+              <w:bottom w:val="single" w:color="BFBFBF" w:sz="4"/>
+              <w:right w:val="single" w:color="BFBFBF" w:sz="4"/>
+            </w:tcBorders>
+            <w:tcMar>
+              <w:top w:type="dxa" w:w="60"/>
+              <w:left w:type="dxa" w:w="100"/>
+              <w:bottom w:type="dxa" w:w="60"/>
+              <w:right w:type="dxa" w:w="100"/>
+            </w:tcMar>
+          </w:tcPr>
+          <w:p>
+            <w:r>
+              <w:rPr>
+                <w:rFonts w:ascii="Arial" w:cs="Arial" w:eastAsia="Arial" w:hAnsi="Arial"/>
+                <w:b/>
+                <w:bCs/>
+                <w:sz w:val="16"/>
+                <w:szCs w:val="16"/>
+              </w:rPr>
+              <w:t xml:space="preserve">4 + 0 = 4</w:t>
+            </w:r>
+          </w:p>
+        </w:tc>
+      </w:tr>
+      <w:tr>
+        <w:tc>
+          <w:tcPr>
+            <w:tcW w:type="dxa" w:w="550"/>
+            <w:tcBorders>
+              <w:top w:val="single" w:color="BFBFBF" w:sz="4"/>
+              <w:left w:val="single" w:color="BFBFBF" w:sz="4"/>
+              <w:bottom w:val="single" w:color="BFBFBF" w:sz="4"/>
+              <w:right w:val="single" w:color="BFBFBF" w:sz="4"/>
+            </w:tcBorders>
+            <w:tcMar>
+              <w:top w:type="dxa" w:w="60"/>
+              <w:left w:type="dxa" w:w="100"/>
+              <w:bottom w:type="dxa" w:w="60"/>
+              <w:right w:type="dxa" w:w="100"/>
+            </w:tcMar>
+          </w:tcPr>
+          <w:p>
+            <w:r>
+              <w:rPr>
+                <w:rFonts w:ascii="Arial" w:cs="Arial" w:eastAsia="Arial" w:hAnsi="Arial"/>
+                <w:b/>
+                <w:bCs/>
+                <w:sz w:val="16"/>
+                <w:szCs w:val="16"/>
+              </w:rPr>
+              <w:t xml:space="preserve">П11</w:t>
             </w:r>
           </w:p>
         </w:tc>
@@ -24756,10 +25020,39 @@
                 <w:rFonts w:ascii="Arial" w:cs="Arial" w:eastAsia="Arial" w:hAnsi="Arial"/>
                 <w:b w:val="false"/>
                 <w:bCs w:val="false"/>
-                <w:sz w:val="18"/>
-                <w:szCs w:val="18"/>
+                <w:sz w:val="16"/>
+                <w:szCs w:val="16"/>
               </w:rPr>
-              <w:t xml:space="preserve">4, 17, 31</w:t>
+              <w:t xml:space="preserve">Автоматизация процесса и агентные сценарии</w:t>
+            </w:r>
+          </w:p>
+        </w:tc>
+        <w:tc>
+          <w:tcPr>
+            <w:tcW w:type="dxa" w:w="2100"/>
+            <w:tcBorders>
+              <w:top w:val="single" w:color="BFBFBF" w:sz="4"/>
+              <w:left w:val="single" w:color="BFBFBF" w:sz="4"/>
+              <w:bottom w:val="single" w:color="BFBFBF" w:sz="4"/>
+              <w:right w:val="single" w:color="BFBFBF" w:sz="4"/>
+            </w:tcBorders>
+            <w:tcMar>
+              <w:top w:type="dxa" w:w="60"/>
+              <w:left w:type="dxa" w:w="100"/>
+              <w:bottom w:type="dxa" w:w="60"/>
+              <w:right w:type="dxa" w:w="100"/>
+            </w:tcMar>
+          </w:tcPr>
+          <w:p>
+            <w:r>
+              <w:rPr>
+                <w:rFonts w:ascii="Arial" w:cs="Arial" w:eastAsia="Arial" w:hAnsi="Arial"/>
+                <w:b w:val="false"/>
+                <w:bCs w:val="false"/>
+                <w:sz w:val="14"/>
+                <w:szCs w:val="14"/>
+              </w:rPr>
+              <w:t xml:space="preserve">PROCESS_AUTOMATION</w:t>
             </w:r>
           </w:p>
         </w:tc>
@@ -24785,10 +25078,68 @@
                 <w:rFonts w:ascii="Arial" w:cs="Arial" w:eastAsia="Arial" w:hAnsi="Arial"/>
                 <w:b w:val="false"/>
                 <w:bCs w:val="false"/>
-                <w:sz w:val="18"/>
-                <w:szCs w:val="18"/>
+                <w:sz w:val="16"/>
+                <w:szCs w:val="16"/>
               </w:rPr>
-              <w:t xml:space="preserve">4</w:t>
+              <w:t xml:space="preserve">4, 17, 31</w:t>
+            </w:r>
+          </w:p>
+        </w:tc>
+        <w:tc>
+          <w:tcPr>
+            <w:tcW w:type="dxa" w:w="1888"/>
+            <w:tcBorders>
+              <w:top w:val="single" w:color="BFBFBF" w:sz="4"/>
+              <w:left w:val="single" w:color="BFBFBF" w:sz="4"/>
+              <w:bottom w:val="single" w:color="BFBFBF" w:sz="4"/>
+              <w:right w:val="single" w:color="BFBFBF" w:sz="4"/>
+            </w:tcBorders>
+            <w:tcMar>
+              <w:top w:type="dxa" w:w="60"/>
+              <w:left w:type="dxa" w:w="100"/>
+              <w:bottom w:type="dxa" w:w="60"/>
+              <w:right w:type="dxa" w:w="100"/>
+            </w:tcMar>
+          </w:tcPr>
+          <w:p>
+            <w:r>
+              <w:rPr>
+                <w:rFonts w:ascii="Arial" w:cs="Arial" w:eastAsia="Arial" w:hAnsi="Arial"/>
+                <w:b w:val="false"/>
+                <w:bCs w:val="false"/>
+                <w:sz w:val="16"/>
+                <w:szCs w:val="16"/>
+              </w:rPr>
+              <w:t xml:space="preserve">22</w:t>
+            </w:r>
+          </w:p>
+        </w:tc>
+        <w:tc>
+          <w:tcPr>
+            <w:tcW w:type="dxa" w:w="1300"/>
+            <w:tcBorders>
+              <w:top w:val="single" w:color="BFBFBF" w:sz="4"/>
+              <w:left w:val="single" w:color="BFBFBF" w:sz="4"/>
+              <w:bottom w:val="single" w:color="BFBFBF" w:sz="4"/>
+              <w:right w:val="single" w:color="BFBFBF" w:sz="4"/>
+            </w:tcBorders>
+            <w:tcMar>
+              <w:top w:type="dxa" w:w="60"/>
+              <w:left w:type="dxa" w:w="100"/>
+              <w:bottom w:type="dxa" w:w="60"/>
+              <w:right w:type="dxa" w:w="100"/>
+            </w:tcMar>
+          </w:tcPr>
+          <w:p>
+            <w:r>
+              <w:rPr>
+                <w:rFonts w:ascii="Arial" w:cs="Arial" w:eastAsia="Arial" w:hAnsi="Arial"/>
+                <w:b/>
+                <w:bCs/>
+                <w:sz w:val="16"/>
+                <w:szCs w:val="16"/>
+              </w:rPr>
+              <w:t xml:space="preserve">3 + 1 = 4</w:t>
             </w:r>
           </w:p>
         </w:tc>

</xml_diff>